<commit_message>
Informe de Factibilidad Arreglado
</commit_message>
<xml_diff>
--- a/FD01-EPIS-Informe de Factibilidad.docx
+++ b/FD01-EPIS-Informe de Factibilidad.docx
@@ -1,6 +1,6 @@
 
 <file path=word/document.xml><?xml version="1.0" encoding="utf-8"?>
-<w:document xmlns:wpc="http://schemas.microsoft.com/office/word/2010/wordprocessingCanvas" xmlns:cx="http://schemas.microsoft.com/office/drawing/2014/chartex" xmlns:cx1="http://schemas.microsoft.com/office/drawing/2015/9/8/chartex" xmlns:cx2="http://schemas.microsoft.com/office/drawing/2015/10/21/chartex" xmlns:cx3="http://schemas.microsoft.com/office/drawing/2016/5/9/chartex" xmlns:cx4="http://schemas.microsoft.com/office/drawing/2016/5/10/chartex" xmlns:cx5="http://schemas.microsoft.com/office/drawing/2016/5/11/chartex" xmlns:cx6="http://schemas.microsoft.com/office/drawing/2016/5/12/chartex" xmlns:cx7="http://schemas.microsoft.com/office/drawing/2016/5/13/chartex" xmlns:cx8="http://schemas.microsoft.com/office/drawing/2016/5/14/chartex" xmlns:mc="http://schemas.openxmlformats.org/markup-compatibility/2006" xmlns:aink="http://schemas.microsoft.com/office/drawing/2016/ink" xmlns:am3d="http://schemas.microsoft.com/office/drawing/2017/model3d" xmlns:o="urn:schemas-microsoft-com:office:office" xmlns:r="http://schemas.openxmlformats.org/officeDocument/2006/relationships" xmlns:m="http://schemas.openxmlformats.org/officeDocument/2006/math" xmlns:v="urn:schemas-microsoft-com:vml" xmlns:wp14="http://schemas.microsoft.com/office/word/2010/wordprocessingDrawing" xmlns:wp="http://schemas.openxmlformats.org/drawingml/2006/wordprocessingDrawing" xmlns:w10="urn:schemas-microsoft-com:office:word" xmlns:w="http://schemas.openxmlformats.org/wordprocessingml/2006/main" xmlns:w14="http://schemas.microsoft.com/office/word/2010/wordml" xmlns:w15="http://schemas.microsoft.com/office/word/2012/wordml" xmlns:w16cex="http://schemas.microsoft.com/office/word/2018/wordml/cex" xmlns:w16cid="http://schemas.microsoft.com/office/word/2016/wordml/cid" xmlns:w16="http://schemas.microsoft.com/office/word/2018/wordml" xmlns:w16sdtdh="http://schemas.microsoft.com/office/word/2020/wordml/sdtdatahash" xmlns:w16se="http://schemas.microsoft.com/office/word/2015/wordml/symex" xmlns:wpg="http://schemas.microsoft.com/office/word/2010/wordprocessingGroup" xmlns:wpi="http://schemas.microsoft.com/office/word/2010/wordprocessingInk" xmlns:wne="http://schemas.microsoft.com/office/word/2006/wordml" xmlns:wps="http://schemas.microsoft.com/office/word/2010/wordprocessingShape" mc:Ignorable="w14 w15 w16se w16cid w16 w16cex w16sdtdh wp14">
+<w:document xmlns:wpc="http://schemas.microsoft.com/office/word/2010/wordprocessingCanvas" xmlns:cx="http://schemas.microsoft.com/office/drawing/2014/chartex" xmlns:cx1="http://schemas.microsoft.com/office/drawing/2015/9/8/chartex" xmlns:cx2="http://schemas.microsoft.com/office/drawing/2015/10/21/chartex" xmlns:cx3="http://schemas.microsoft.com/office/drawing/2016/5/9/chartex" xmlns:cx4="http://schemas.microsoft.com/office/drawing/2016/5/10/chartex" xmlns:cx5="http://schemas.microsoft.com/office/drawing/2016/5/11/chartex" xmlns:cx6="http://schemas.microsoft.com/office/drawing/2016/5/12/chartex" xmlns:cx7="http://schemas.microsoft.com/office/drawing/2016/5/13/chartex" xmlns:cx8="http://schemas.microsoft.com/office/drawing/2016/5/14/chartex" xmlns:mc="http://schemas.openxmlformats.org/markup-compatibility/2006" xmlns:aink="http://schemas.microsoft.com/office/drawing/2016/ink" xmlns:am3d="http://schemas.microsoft.com/office/drawing/2017/model3d" xmlns:o="urn:schemas-microsoft-com:office:office" xmlns:oel="http://schemas.microsoft.com/office/2019/extlst" xmlns:r="http://schemas.openxmlformats.org/officeDocument/2006/relationships" xmlns:m="http://schemas.openxmlformats.org/officeDocument/2006/math" xmlns:v="urn:schemas-microsoft-com:vml" xmlns:wp14="http://schemas.microsoft.com/office/word/2010/wordprocessingDrawing" xmlns:wp="http://schemas.openxmlformats.org/drawingml/2006/wordprocessingDrawing" xmlns:w10="urn:schemas-microsoft-com:office:word" xmlns:w="http://schemas.openxmlformats.org/wordprocessingml/2006/main" xmlns:w14="http://schemas.microsoft.com/office/word/2010/wordml" xmlns:w15="http://schemas.microsoft.com/office/word/2012/wordml" xmlns:w16cex="http://schemas.microsoft.com/office/word/2018/wordml/cex" xmlns:w16cid="http://schemas.microsoft.com/office/word/2016/wordml/cid" xmlns:w16="http://schemas.microsoft.com/office/word/2018/wordml" xmlns:w16du="http://schemas.microsoft.com/office/word/2023/wordml/word16du" xmlns:w16sdtdh="http://schemas.microsoft.com/office/word/2020/wordml/sdtdatahash" xmlns:w16sdtfl="http://schemas.microsoft.com/office/word/2024/wordml/sdtformatlock" xmlns:w16se="http://schemas.microsoft.com/office/word/2015/wordml/symex" xmlns:wpg="http://schemas.microsoft.com/office/word/2010/wordprocessingGroup" xmlns:wpi="http://schemas.microsoft.com/office/word/2010/wordprocessingInk" xmlns:wne="http://schemas.microsoft.com/office/word/2006/wordml" xmlns:wps="http://schemas.microsoft.com/office/word/2010/wordprocessingShape" mc:Ignorable="w14 w15 w16se w16cid w16 w16cex w16sdtdh w16sdtfl w16du wp14">
   <w:body>
     <w:p>
       <w:pPr>
@@ -283,7 +283,55 @@
           <w:sz w:val="36"/>
           <w:szCs w:val="36"/>
         </w:rPr>
-        <w:t>“Sistema de Inteligencia de Negocios para el Análisis del Mercado Laboral Tecnológico”</w:t>
+        <w:t>“</w:t>
+      </w:r>
+      <w:proofErr w:type="spellStart"/>
+      <w:r>
+        <w:rPr>
+          <w:rFonts w:ascii="Arial" w:hAnsi="Arial" w:cs="Arial"/>
+          <w:b/>
+          <w:iCs/>
+          <w:color w:val="000000"/>
+          <w:sz w:val="36"/>
+          <w:szCs w:val="36"/>
+        </w:rPr>
+        <w:t>JobForUS</w:t>
+      </w:r>
+      <w:proofErr w:type="spellEnd"/>
+      <w:r>
+        <w:rPr>
+          <w:rFonts w:ascii="Arial" w:hAnsi="Arial" w:cs="Arial"/>
+          <w:b/>
+          <w:iCs/>
+          <w:color w:val="000000"/>
+          <w:sz w:val="36"/>
+          <w:szCs w:val="36"/>
+        </w:rPr>
+        <w:t xml:space="preserve"> - </w:t>
+      </w:r>
+      <w:proofErr w:type="spellStart"/>
+      <w:r>
+        <w:rPr>
+          <w:rFonts w:ascii="Arial" w:hAnsi="Arial" w:cs="Arial"/>
+          <w:b/>
+          <w:iCs/>
+          <w:color w:val="000000"/>
+          <w:sz w:val="36"/>
+          <w:szCs w:val="36"/>
+        </w:rPr>
+        <w:t>Dashboard</w:t>
+      </w:r>
+      <w:proofErr w:type="spellEnd"/>
+      <w:r>
+        <w:rPr>
+          <w:rFonts w:ascii="Arial" w:hAnsi="Arial" w:cs="Arial"/>
+          <w:b/>
+          <w:iCs/>
+          <w:color w:val="000000"/>
+          <w:sz w:val="36"/>
+          <w:szCs w:val="36"/>
+        </w:rPr>
+        <w:t xml:space="preserve"> para el Análisis del Mercado Laboral Tecnológico”</w:t>
       </w:r>
     </w:p>
     <w:p>
@@ -421,47 +469,7 @@
           <w:szCs w:val="32"/>
           <w:lang w:eastAsia="es-PE"/>
         </w:rPr>
-        <w:t xml:space="preserve"> </w:t>
-      </w:r>
-      <w:proofErr w:type="spellStart"/>
-      <w:r>
-        <w:rPr>
-          <w:rFonts w:ascii="Arial" w:eastAsia="Times New Roman" w:hAnsi="Arial" w:cs="Arial"/>
-          <w:sz w:val="32"/>
-          <w:szCs w:val="32"/>
-          <w:lang w:eastAsia="es-PE"/>
-        </w:rPr>
-        <w:t>Mag</w:t>
-      </w:r>
-      <w:proofErr w:type="spellEnd"/>
-      <w:r>
-        <w:rPr>
-          <w:rFonts w:ascii="Arial" w:eastAsia="Times New Roman" w:hAnsi="Arial" w:cs="Arial"/>
-          <w:sz w:val="32"/>
-          <w:szCs w:val="32"/>
-          <w:lang w:eastAsia="es-PE"/>
-        </w:rPr>
-        <w:t xml:space="preserve">. Patrick </w:t>
-      </w:r>
-      <w:proofErr w:type="spellStart"/>
-      <w:r>
-        <w:rPr>
-          <w:rFonts w:ascii="Arial" w:eastAsia="Times New Roman" w:hAnsi="Arial" w:cs="Arial"/>
-          <w:sz w:val="32"/>
-          <w:szCs w:val="32"/>
-          <w:lang w:eastAsia="es-PE"/>
-        </w:rPr>
-        <w:t>Quadros</w:t>
-      </w:r>
-      <w:proofErr w:type="spellEnd"/>
-      <w:r>
-        <w:rPr>
-          <w:rFonts w:ascii="Arial" w:eastAsia="Times New Roman" w:hAnsi="Arial" w:cs="Arial"/>
-          <w:sz w:val="32"/>
-          <w:szCs w:val="32"/>
-          <w:lang w:eastAsia="es-PE"/>
-        </w:rPr>
-        <w:t xml:space="preserve"> Quiroga</w:t>
+        <w:t xml:space="preserve"> Mag. Patrick Quadros Quiroga</w:t>
       </w:r>
       <w:r>
         <w:rPr>
@@ -899,32 +907,34 @@
           <w:lang w:val="es-PE"/>
         </w:rPr>
       </w:pPr>
+      <w:proofErr w:type="spellStart"/>
       <w:r>
         <w:rPr>
           <w:rFonts w:ascii="Times New Roman" w:hAnsi="Times New Roman"/>
           <w:color w:val="000000" w:themeColor="text1"/>
           <w:lang w:val="es-PE"/>
         </w:rPr>
-        <w:t xml:space="preserve">Sistema </w:t>
-      </w:r>
+        <w:t>JobForUS</w:t>
+      </w:r>
+      <w:proofErr w:type="spellEnd"/>
       <w:r>
         <w:rPr>
           <w:rFonts w:ascii="Times New Roman" w:hAnsi="Times New Roman"/>
-          <w:iCs/>
           <w:color w:val="000000" w:themeColor="text1"/>
           <w:lang w:val="es-PE"/>
         </w:rPr>
-        <w:t>de</w:t>
-      </w:r>
+        <w:t xml:space="preserve"> - </w:t>
+      </w:r>
+      <w:proofErr w:type="spellStart"/>
       <w:r>
         <w:rPr>
           <w:rFonts w:ascii="Times New Roman" w:hAnsi="Times New Roman"/>
-          <w:i/>
           <w:color w:val="000000" w:themeColor="text1"/>
           <w:lang w:val="es-PE"/>
         </w:rPr>
-        <w:t xml:space="preserve"> </w:t>
-      </w:r>
+        <w:t>Dashboard</w:t>
+      </w:r>
+      <w:proofErr w:type="spellEnd"/>
       <w:r>
         <w:rPr>
           <w:rFonts w:ascii="Times New Roman" w:hAnsi="Times New Roman"/>
@@ -932,7 +942,7 @@
           <w:color w:val="000000" w:themeColor="text1"/>
           <w:lang w:val="es-PE"/>
         </w:rPr>
-        <w:t>Inteligencia de Negocios para el Análisis del Mercado Laboral Tecnológico</w:t>
+        <w:t xml:space="preserve"> para el Análisis del Mercado Laboral Tecnológico</w:t>
       </w:r>
       <w:r>
         <w:rPr>
@@ -1520,7 +1530,6 @@
         <w:tc>
           <w:tcPr>
             <w:tcW w:w="3058" w:type="dxa"/>
-            <w:shd w:val="clear" w:color="auto" w:fill="auto"/>
             <w:vAlign w:val="center"/>
           </w:tcPr>
           <w:p>
@@ -2865,7 +2874,58 @@
           <w:rFonts w:ascii="Arial" w:hAnsi="Arial" w:cs="Arial"/>
           <w:lang w:val="es-MX"/>
         </w:rPr>
-        <w:t xml:space="preserve"> - Sistema de Inteligencia de Mercado Laboral para Ingenieros de Sistemas</w:t>
+        <w:t xml:space="preserve"> </w:t>
+      </w:r>
+      <w:r>
+        <w:rPr>
+          <w:rFonts w:ascii="Arial" w:hAnsi="Arial" w:cs="Arial"/>
+          <w:lang w:val="es-MX"/>
+        </w:rPr>
+        <w:t>–</w:t>
+      </w:r>
+      <w:r>
+        <w:rPr>
+          <w:rFonts w:ascii="Arial" w:hAnsi="Arial" w:cs="Arial"/>
+          <w:lang w:val="es-MX"/>
+        </w:rPr>
+        <w:t xml:space="preserve"> </w:t>
+      </w:r>
+      <w:proofErr w:type="spellStart"/>
+      <w:r>
+        <w:rPr>
+          <w:rFonts w:ascii="Arial" w:hAnsi="Arial" w:cs="Arial"/>
+          <w:lang w:val="es-MX"/>
+        </w:rPr>
+        <w:t>Dashboard</w:t>
+      </w:r>
+      <w:proofErr w:type="spellEnd"/>
+      <w:r>
+        <w:rPr>
+          <w:rFonts w:ascii="Arial" w:hAnsi="Arial" w:cs="Arial"/>
+          <w:lang w:val="es-MX"/>
+        </w:rPr>
+        <w:t xml:space="preserve"> para el </w:t>
+      </w:r>
+      <w:r>
+        <w:rPr>
+          <w:rFonts w:ascii="Arial" w:hAnsi="Arial" w:cs="Arial"/>
+          <w:lang w:val="es-MX"/>
+        </w:rPr>
+        <w:t>a</w:t>
+      </w:r>
+      <w:r>
+        <w:rPr>
+          <w:rFonts w:ascii="Arial" w:hAnsi="Arial" w:cs="Arial"/>
+          <w:lang w:val="es-MX"/>
+        </w:rPr>
+        <w:t>nálisis</w:t>
+      </w:r>
+      <w:r>
+        <w:rPr>
+          <w:rFonts w:ascii="Arial" w:hAnsi="Arial" w:cs="Arial"/>
+          <w:lang w:val="es-MX"/>
+        </w:rPr>
+        <w:t xml:space="preserve"> de Mercado Laboral para Ingenieros de Sistemas</w:t>
       </w:r>
     </w:p>
     <w:p>
@@ -2894,6 +2954,13 @@
         </w:rPr>
         <w:t>La duración del proyecto será de 3 meses, considerando una entrega del sistema completo al final del primer mes en el día 24 de abril del 2026. Mientras que los 2 meses siguientes servirán para la mejora del sistema o cambios en ella.</w:t>
       </w:r>
+      <w:r>
+        <w:rPr>
+          <w:rFonts w:ascii="Arial" w:hAnsi="Arial" w:cs="Arial"/>
+          <w:lang w:val="es-MX"/>
+        </w:rPr>
+        <w:t xml:space="preserve"> Concluyendo así el día 27 de junio del 2026.</w:t>
+      </w:r>
     </w:p>
     <w:p>
       <w:pPr>
@@ -2914,12 +2981,28 @@
           <w:lang w:val="es-MX"/>
         </w:rPr>
       </w:pPr>
+      <w:proofErr w:type="spellStart"/>
       <w:r>
         <w:rPr>
           <w:rFonts w:ascii="Arial" w:hAnsi="Arial" w:cs="Arial"/>
           <w:lang w:val="es-MX"/>
         </w:rPr>
-        <w:t xml:space="preserve">El </w:t>
+        <w:t>JobForUS</w:t>
+      </w:r>
+      <w:proofErr w:type="spellEnd"/>
+      <w:r>
+        <w:rPr>
+          <w:rFonts w:ascii="Arial" w:hAnsi="Arial" w:cs="Arial"/>
+          <w:lang w:val="es-MX"/>
+        </w:rPr>
+        <w:t xml:space="preserve"> </w:t>
+      </w:r>
+      <w:r>
+        <w:rPr>
+          <w:rFonts w:ascii="Arial" w:hAnsi="Arial" w:cs="Arial"/>
+          <w:lang w:val="es-MX"/>
+        </w:rPr>
+        <w:t xml:space="preserve">es un </w:t>
       </w:r>
       <w:proofErr w:type="spellStart"/>
       <w:r>
@@ -2927,7 +3010,7 @@
           <w:rFonts w:ascii="Arial" w:hAnsi="Arial" w:cs="Arial"/>
           <w:lang w:val="es-MX"/>
         </w:rPr>
-        <w:t>JobMarket</w:t>
+        <w:t>Dashboard</w:t>
       </w:r>
       <w:proofErr w:type="spellEnd"/>
       <w:r>
@@ -2937,21 +3020,12 @@
         </w:rPr>
         <w:t xml:space="preserve"> </w:t>
       </w:r>
-      <w:proofErr w:type="spellStart"/>
       <w:r>
         <w:rPr>
           <w:rFonts w:ascii="Arial" w:hAnsi="Arial" w:cs="Arial"/>
           <w:lang w:val="es-MX"/>
         </w:rPr>
-        <w:t>Analyzer</w:t>
-      </w:r>
-      <w:proofErr w:type="spellEnd"/>
-      <w:r>
-        <w:rPr>
-          <w:rFonts w:ascii="Arial" w:hAnsi="Arial" w:cs="Arial"/>
-          <w:lang w:val="es-MX"/>
-        </w:rPr>
-        <w:t xml:space="preserve"> es un sistema de Inteligencia de Negocios (BI) diseñado para analizar ofertas laborales del sector tecnológico, específicamente aquellas dirigidas a profesionales y estudiantes de Ingeniería de Sistemas.</w:t>
+        <w:t>de Inteligencia de Negocios (BI) diseñado para analizar ofertas laborales del sector tecnológico, específicamente aquellas dirigidas a profesionales y estudiantes de Ingeniería de Sistemas.</w:t>
       </w:r>
     </w:p>
     <w:p>
@@ -2982,7 +3056,27 @@
         <w:rPr>
           <w:rFonts w:ascii="Arial" w:hAnsi="Arial" w:cs="Arial"/>
         </w:rPr>
-        <w:t>Desarrollar un Sistema de Inteligencia de Negocios que analice ofertas laborales del sector tecnológico, para proporcionar a los estudiantes de Ingeniería de Sistemas información confiable, actualizada y accionable sobre salarios, tecnologías demandadas y tendencias del mercado laboral, facilitando así su toma de decisiones profesionales.</w:t>
+        <w:t xml:space="preserve">Desarrollar un </w:t>
+      </w:r>
+      <w:proofErr w:type="spellStart"/>
+      <w:r>
+        <w:rPr>
+          <w:rFonts w:ascii="Arial" w:hAnsi="Arial" w:cs="Arial"/>
+        </w:rPr>
+        <w:t>Dashboard</w:t>
+      </w:r>
+      <w:proofErr w:type="spellEnd"/>
+      <w:r>
+        <w:rPr>
+          <w:rFonts w:ascii="Arial" w:hAnsi="Arial" w:cs="Arial"/>
+        </w:rPr>
+        <w:t xml:space="preserve"> </w:t>
+      </w:r>
+      <w:r>
+        <w:rPr>
+          <w:rFonts w:ascii="Arial" w:hAnsi="Arial" w:cs="Arial"/>
+        </w:rPr>
+        <w:t>de Inteligencia de Negocios que analice ofertas laborales del sector tecnológico, para proporcionar a los estudiantes de Ingeniería de Sistemas información confiable, actualizada y accionable sobre salarios, tecnologías demandadas y tendencias del mercado laboral, facilitando así su toma de decisiones profesionales.</w:t>
       </w:r>
     </w:p>
     <w:p>
@@ -3042,7 +3136,37 @@
         <w:rPr>
           <w:rFonts w:ascii="Arial" w:hAnsi="Arial" w:cs="Arial"/>
         </w:rPr>
-        <w:t>Se obtendrá una base de datos centralizada con un mínimo de 1000 registros de ofertas laborales, provenientes de al menos 2 fuentes diferentes, con metadatos de extracción</w:t>
+        <w:t xml:space="preserve">Se obtendrá una base de datos centralizada con un mínimo de </w:t>
+      </w:r>
+      <w:r>
+        <w:rPr>
+          <w:rFonts w:ascii="Arial" w:hAnsi="Arial" w:cs="Arial"/>
+        </w:rPr>
+        <w:t xml:space="preserve">10000 </w:t>
+      </w:r>
+      <w:r>
+        <w:rPr>
+          <w:rFonts w:ascii="Arial" w:hAnsi="Arial" w:cs="Arial"/>
+        </w:rPr>
+        <w:t xml:space="preserve">registros de ofertas laborales, provenientes de al menos </w:t>
+      </w:r>
+      <w:r>
+        <w:rPr>
+          <w:rFonts w:ascii="Arial" w:hAnsi="Arial" w:cs="Arial"/>
+        </w:rPr>
+        <w:t xml:space="preserve">1 </w:t>
+      </w:r>
+      <w:r>
+        <w:rPr>
+          <w:rFonts w:ascii="Arial" w:hAnsi="Arial" w:cs="Arial"/>
+        </w:rPr>
+        <w:t>fuente, con metadatos de extracción</w:t>
+      </w:r>
+      <w:r>
+        <w:rPr>
+          <w:rFonts w:ascii="Arial" w:hAnsi="Arial" w:cs="Arial"/>
+        </w:rPr>
+        <w:t>.</w:t>
       </w:r>
     </w:p>
     <w:p>
@@ -3304,7 +3428,31 @@
           <w:iCs/>
           <w:color w:val="000000"/>
         </w:rPr>
-        <w:t xml:space="preserve">registros de ofertas laborales) podría superar la capacidad de procesamiento de las herramientas gratuitas seleccionadas, como </w:t>
+        <w:t>registros de ofertas laborales) podría superar la capacidad de procesamiento de las herramientas gratuitas seleccionadas, como Power BI Desktop</w:t>
+      </w:r>
+      <w:r>
+        <w:rPr>
+          <w:rFonts w:ascii="Arial" w:hAnsi="Arial" w:cs="Arial"/>
+          <w:iCs/>
+          <w:color w:val="000000"/>
+        </w:rPr>
+        <w:t xml:space="preserve">, </w:t>
+      </w:r>
+      <w:r>
+        <w:rPr>
+          <w:rFonts w:ascii="Arial" w:hAnsi="Arial" w:cs="Arial"/>
+          <w:iCs/>
+          <w:color w:val="000000"/>
+        </w:rPr>
+        <w:t>SQLite</w:t>
+      </w:r>
+      <w:r>
+        <w:rPr>
+          <w:rFonts w:ascii="Arial" w:hAnsi="Arial" w:cs="Arial"/>
+          <w:iCs/>
+          <w:color w:val="000000"/>
+        </w:rPr>
+        <w:t xml:space="preserve"> o </w:t>
       </w:r>
       <w:proofErr w:type="spellStart"/>
       <w:r>
@@ -3313,7 +3461,7 @@
           <w:iCs/>
           <w:color w:val="000000"/>
         </w:rPr>
-        <w:t>Power</w:t>
+        <w:t>BigQuery</w:t>
       </w:r>
       <w:proofErr w:type="spellEnd"/>
       <w:r>
@@ -3322,7 +3470,7 @@
           <w:iCs/>
           <w:color w:val="000000"/>
         </w:rPr>
-        <w:t xml:space="preserve"> BI Desktop o SQLite. Esto podría manifestarse en tiempos de carga excesivamente largos, lentitud en los filtros del </w:t>
+        <w:t xml:space="preserve">. Esto podría manifestarse en tiempos de carga excesivamente largos, lentitud en los filtros del </w:t>
       </w:r>
       <w:proofErr w:type="spellStart"/>
       <w:r>
@@ -3472,7 +3620,7 @@
           <w:iCs/>
           <w:color w:val="000000"/>
         </w:rPr>
-        <w:t xml:space="preserve">Aunque el proyecto está diseñado para utilizar herramientas gratuitas, podría surgir la necesidad de adquirir alguna licencia o servicio de pago si las herramientas gratuitas resultan insuficientes. Por ejemplo, la versión gratuita de </w:t>
+        <w:t xml:space="preserve">Aunque el proyecto está diseñado para utilizar herramientas gratuitas, podría surgir la necesidad de adquirir alguna licencia o servicio de pago si las herramientas gratuitas resultan insuficientes. Por ejemplo, la versión gratuita de Power BI tiene limitaciones para compartir </w:t>
       </w:r>
       <w:proofErr w:type="spellStart"/>
       <w:r>
@@ -3481,7 +3629,7 @@
           <w:iCs/>
           <w:color w:val="000000"/>
         </w:rPr>
-        <w:t>Power</w:t>
+        <w:t>dashboards</w:t>
       </w:r>
       <w:proofErr w:type="spellEnd"/>
       <w:r>
@@ -3490,61 +3638,7 @@
           <w:iCs/>
           <w:color w:val="000000"/>
         </w:rPr>
-        <w:t xml:space="preserve"> BI tiene limitaciones para compartir </w:t>
-      </w:r>
-      <w:proofErr w:type="spellStart"/>
-      <w:r>
-        <w:rPr>
-          <w:rFonts w:ascii="Arial" w:hAnsi="Arial" w:cs="Arial"/>
-          <w:iCs/>
-          <w:color w:val="000000"/>
-        </w:rPr>
-        <w:t>dashboards</w:t>
-      </w:r>
-      <w:proofErr w:type="spellEnd"/>
-      <w:r>
-        <w:rPr>
-          <w:rFonts w:ascii="Arial" w:hAnsi="Arial" w:cs="Arial"/>
-          <w:iCs/>
-          <w:color w:val="000000"/>
-        </w:rPr>
-        <w:t xml:space="preserve"> públicamente, y la publicación en </w:t>
-      </w:r>
-      <w:proofErr w:type="spellStart"/>
-      <w:r>
-        <w:rPr>
-          <w:rFonts w:ascii="Arial" w:hAnsi="Arial" w:cs="Arial"/>
-          <w:iCs/>
-          <w:color w:val="000000"/>
-        </w:rPr>
-        <w:t>Power</w:t>
-      </w:r>
-      <w:proofErr w:type="spellEnd"/>
-      <w:r>
-        <w:rPr>
-          <w:rFonts w:ascii="Arial" w:hAnsi="Arial" w:cs="Arial"/>
-          <w:iCs/>
-          <w:color w:val="000000"/>
-        </w:rPr>
-        <w:t xml:space="preserve"> BI </w:t>
-      </w:r>
-      <w:proofErr w:type="spellStart"/>
-      <w:r>
-        <w:rPr>
-          <w:rFonts w:ascii="Arial" w:hAnsi="Arial" w:cs="Arial"/>
-          <w:iCs/>
-          <w:color w:val="000000"/>
-        </w:rPr>
-        <w:t>Service</w:t>
-      </w:r>
-      <w:proofErr w:type="spellEnd"/>
-      <w:r>
-        <w:rPr>
-          <w:rFonts w:ascii="Arial" w:hAnsi="Arial" w:cs="Arial"/>
-          <w:iCs/>
-          <w:color w:val="000000"/>
-        </w:rPr>
-        <w:t xml:space="preserve"> podría requerir una licencia Pro en algunos escenarios.</w:t>
+        <w:t xml:space="preserve"> públicamente, y la publicación en Power BI Service podría requerir una licencia Pro en algunos escenarios.</w:t>
       </w:r>
     </w:p>
     <w:p>
@@ -3998,7 +4092,33 @@
           <w:iCs/>
           <w:lang w:val="es-MX"/>
         </w:rPr>
-        <w:t>Base de datos (SQLite)</w:t>
+        <w:t>Base de datos (SQLite</w:t>
+      </w:r>
+      <w:r>
+        <w:rPr>
+          <w:rFonts w:ascii="Arial" w:hAnsi="Arial" w:cs="Arial"/>
+          <w:iCs/>
+          <w:lang w:val="es-MX"/>
+        </w:rPr>
+        <w:t xml:space="preserve"> o </w:t>
+      </w:r>
+      <w:proofErr w:type="spellStart"/>
+      <w:r>
+        <w:rPr>
+          <w:rFonts w:ascii="Arial" w:hAnsi="Arial" w:cs="Arial"/>
+          <w:iCs/>
+          <w:lang w:val="es-MX"/>
+        </w:rPr>
+        <w:t>BigQuery</w:t>
+      </w:r>
+      <w:proofErr w:type="spellEnd"/>
+      <w:r>
+        <w:rPr>
+          <w:rFonts w:ascii="Arial" w:hAnsi="Arial" w:cs="Arial"/>
+          <w:iCs/>
+          <w:lang w:val="es-MX"/>
+        </w:rPr>
+        <w:t>)</w:t>
       </w:r>
     </w:p>
     <w:p>
@@ -4021,33 +4141,7 @@
           <w:iCs/>
           <w:lang w:val="en-US"/>
         </w:rPr>
-        <w:t xml:space="preserve">Power BI Desktop, </w:t>
-      </w:r>
-      <w:proofErr w:type="spellStart"/>
-      <w:r>
-        <w:rPr>
-          <w:rFonts w:ascii="Arial" w:hAnsi="Arial" w:cs="Arial"/>
-          <w:iCs/>
-          <w:lang w:val="en-US"/>
-        </w:rPr>
-        <w:t>alternativa</w:t>
-      </w:r>
-      <w:proofErr w:type="spellEnd"/>
-      <w:r>
-        <w:rPr>
-          <w:rFonts w:ascii="Arial" w:hAnsi="Arial" w:cs="Arial"/>
-          <w:iCs/>
-          <w:lang w:val="en-US"/>
-        </w:rPr>
-        <w:t xml:space="preserve"> T</w:t>
-      </w:r>
-      <w:r>
-        <w:rPr>
-          <w:rFonts w:ascii="Arial" w:hAnsi="Arial" w:cs="Arial"/>
-          <w:iCs/>
-          <w:lang w:val="en-US"/>
-        </w:rPr>
-        <w:t>ableau</w:t>
+        <w:t xml:space="preserve">Power BI Desktop </w:t>
       </w:r>
     </w:p>
     <w:p>
@@ -4151,7 +4245,31 @@
         <w:rPr>
           <w:rFonts w:ascii="Arial" w:hAnsi="Arial" w:cs="Arial"/>
         </w:rPr>
-        <w:t xml:space="preserve">El proyecto no requiere un servidor dedicado para su funcionamiento. La base de datos puede alojarse localmente en la computadora de desarrollo utilizando SQLite, que es una base de datos embebida que no requiere servidor. En el escenario en que se opte por PostgreSQL como alternativa, se puede utilizar un servicio gratuito en la nube como </w:t>
+        <w:t>El proyecto no requiere un servidor dedicado para su funcionamiento</w:t>
+      </w:r>
+      <w:r>
+        <w:rPr>
+          <w:rFonts w:ascii="Arial" w:hAnsi="Arial" w:cs="Arial"/>
+        </w:rPr>
+        <w:t>, a menos que se manejen varios datos</w:t>
+      </w:r>
+      <w:r>
+        <w:rPr>
+          <w:rFonts w:ascii="Arial" w:hAnsi="Arial" w:cs="Arial"/>
+        </w:rPr>
+        <w:t>. La base de datos puede alojarse localmente en la computadora de desarrollo utilizando SQLite, que es una base de datos embebida que no requiere servidor. En el escenario en que se opte</w:t>
+      </w:r>
+      <w:r>
+        <w:rPr>
+          <w:rFonts w:ascii="Arial" w:hAnsi="Arial" w:cs="Arial"/>
+        </w:rPr>
+        <w:t xml:space="preserve"> por cargar los datos en la nube</w:t>
+      </w:r>
+      <w:r>
+        <w:rPr>
+          <w:rFonts w:ascii="Arial" w:hAnsi="Arial" w:cs="Arial"/>
+        </w:rPr>
+        <w:t xml:space="preserve">, se puede utilizar un servicio gratuito en la nube como </w:t>
       </w:r>
       <w:proofErr w:type="spellStart"/>
       <w:r>
@@ -4179,7 +4297,27 @@
         <w:rPr>
           <w:rFonts w:ascii="Arial" w:hAnsi="Arial" w:cs="Arial"/>
         </w:rPr>
-        <w:t>, los cuales proveen servidores de base de datos sin costo para proyectos académicos.</w:t>
+        <w:t>, los cuales proveen servidores de base de datos sin costo para proyectos académicos</w:t>
+      </w:r>
+      <w:r>
+        <w:rPr>
+          <w:rFonts w:ascii="Arial" w:hAnsi="Arial" w:cs="Arial"/>
+        </w:rPr>
+        <w:t xml:space="preserve">, para este proyecto se opto por utilizar SQLite y </w:t>
+      </w:r>
+      <w:proofErr w:type="spellStart"/>
+      <w:r>
+        <w:rPr>
+          <w:rFonts w:ascii="Arial" w:hAnsi="Arial" w:cs="Arial"/>
+        </w:rPr>
+        <w:t>BigQuery</w:t>
+      </w:r>
+      <w:proofErr w:type="spellEnd"/>
+      <w:r>
+        <w:rPr>
+          <w:rFonts w:ascii="Arial" w:hAnsi="Arial" w:cs="Arial"/>
+        </w:rPr>
+        <w:t>.</w:t>
       </w:r>
     </w:p>
     <w:p>
@@ -4198,21 +4336,7 @@
         <w:rPr>
           <w:rFonts w:ascii="Arial" w:hAnsi="Arial" w:cs="Arial"/>
         </w:rPr>
-        <w:t xml:space="preserve">El proyecto puede desarrollarse en Windows 10 o superior (recomendado para </w:t>
-      </w:r>
-      <w:proofErr w:type="spellStart"/>
-      <w:r>
-        <w:rPr>
-          <w:rFonts w:ascii="Arial" w:hAnsi="Arial" w:cs="Arial"/>
-        </w:rPr>
-        <w:t>Power</w:t>
-      </w:r>
-      <w:proofErr w:type="spellEnd"/>
-      <w:r>
-        <w:rPr>
-          <w:rFonts w:ascii="Arial" w:hAnsi="Arial" w:cs="Arial"/>
-        </w:rPr>
-        <w:t xml:space="preserve"> BI Desktop), macOS versión 11 o superior, o alguna distribución de Linux como Ubuntu 20.04 o superior.</w:t>
+        <w:t>El proyecto puede desarrollarse en Windows 10 o superior (recomendado para Power BI Desktop), macOS versión 11 o superior, o alguna distribución de Linux como Ubuntu 20.04 o superior.</w:t>
       </w:r>
     </w:p>
     <w:p>
@@ -4311,21 +4435,7 @@
         <w:rPr>
           <w:rFonts w:ascii="Arial" w:hAnsi="Arial" w:cs="Arial"/>
         </w:rPr>
-        <w:t xml:space="preserve">Se requiere </w:t>
-      </w:r>
-      <w:proofErr w:type="spellStart"/>
-      <w:r>
-        <w:rPr>
-          <w:rFonts w:ascii="Arial" w:hAnsi="Arial" w:cs="Arial"/>
-        </w:rPr>
-        <w:t>Power</w:t>
-      </w:r>
-      <w:proofErr w:type="spellEnd"/>
-      <w:r>
-        <w:rPr>
-          <w:rFonts w:ascii="Arial" w:hAnsi="Arial" w:cs="Arial"/>
-        </w:rPr>
-        <w:t xml:space="preserve"> BI Desktop (versión gratuita) para el desarrollo del </w:t>
+        <w:t xml:space="preserve">Se requiere Power BI Desktop (versión gratuita) para el desarrollo del </w:t>
       </w:r>
       <w:proofErr w:type="spellStart"/>
       <w:r>
@@ -4373,6 +4483,12 @@
           <w:rFonts w:ascii="Arial" w:hAnsi="Arial" w:cs="Arial"/>
         </w:rPr>
         <w:t xml:space="preserve"> final publicado, los usuarios solo necesitan un navegador web actualizado como Google Chrome, Mozilla Firefox, Microsoft Edge o Safari</w:t>
+      </w:r>
+      <w:r>
+        <w:rPr>
+          <w:rFonts w:ascii="Arial" w:hAnsi="Arial" w:cs="Arial"/>
+        </w:rPr>
+        <w:t>.</w:t>
       </w:r>
     </w:p>
     <w:p>
@@ -6334,7 +6450,35 @@
           <w:rFonts w:ascii="Arial" w:hAnsi="Arial" w:cs="Arial"/>
           <w:lang w:val="es-MX"/>
         </w:rPr>
-        <w:t>os egresados podrán utilizar el sistema para evaluar si los salarios que les ofrecen están alineados con el mercado, y podrán identificar oportunidades laborales en tecnologías emergentes.</w:t>
+        <w:t xml:space="preserve">os egresados podrán utilizar el sistema para evaluar si los salarios que les ofrecen están alineados con el mercado, y podrán identificar oportunidades laborales en </w:t>
+      </w:r>
+      <w:r>
+        <w:rPr>
+          <w:rFonts w:ascii="Arial" w:hAnsi="Arial" w:cs="Arial"/>
+          <w:lang w:val="es-MX"/>
+        </w:rPr>
+        <w:t xml:space="preserve">diversas </w:t>
+      </w:r>
+      <w:r>
+        <w:rPr>
+          <w:rFonts w:ascii="Arial" w:hAnsi="Arial" w:cs="Arial"/>
+          <w:lang w:val="es-MX"/>
+        </w:rPr>
+        <w:t>tecnologías</w:t>
+      </w:r>
+      <w:r>
+        <w:rPr>
+          <w:rFonts w:ascii="Arial" w:hAnsi="Arial" w:cs="Arial"/>
+          <w:lang w:val="es-MX"/>
+        </w:rPr>
+        <w:t xml:space="preserve"> globalmente</w:t>
+      </w:r>
+      <w:r>
+        <w:rPr>
+          <w:rFonts w:ascii="Arial" w:hAnsi="Arial" w:cs="Arial"/>
+          <w:lang w:val="es-MX"/>
+        </w:rPr>
+        <w:t>.</w:t>
       </w:r>
     </w:p>
     <w:p>
@@ -6378,37 +6522,23 @@
           <w:rFonts w:ascii="Arial" w:hAnsi="Arial" w:cs="Arial"/>
           <w:lang w:val="es-MX"/>
         </w:rPr>
-        <w:t>E</w:t>
-      </w:r>
+        <w:t xml:space="preserve">El mantenimiento de los datos es mínimo. Se recomienda actualizar el </w:t>
+      </w:r>
+      <w:proofErr w:type="spellStart"/>
       <w:r>
         <w:rPr>
           <w:rFonts w:ascii="Arial" w:hAnsi="Arial" w:cs="Arial"/>
           <w:lang w:val="es-MX"/>
         </w:rPr>
-        <w:t xml:space="preserve">l mantenimiento de los datos es mínimo. Se recomienda actualizar el </w:t>
-      </w:r>
-      <w:proofErr w:type="spellStart"/>
+        <w:t>dataset</w:t>
+      </w:r>
+      <w:proofErr w:type="spellEnd"/>
       <w:r>
         <w:rPr>
           <w:rFonts w:ascii="Arial" w:hAnsi="Arial" w:cs="Arial"/>
           <w:lang w:val="es-MX"/>
         </w:rPr>
-        <w:t>dataset</w:t>
-      </w:r>
-      <w:proofErr w:type="spellEnd"/>
-      <w:r>
-        <w:rPr>
-          <w:rFonts w:ascii="Arial" w:hAnsi="Arial" w:cs="Arial"/>
-          <w:lang w:val="es-MX"/>
-        </w:rPr>
-        <w:t xml:space="preserve"> cada seis meses o cada año, lo cual puede ser realizado por un estudiante de semestres superiores siguiendo la documentación del código fuente. El proceso está documentado y no requiere conocimientos avanzados.</w:t>
-      </w:r>
-      <w:r>
-        <w:rPr>
-          <w:rFonts w:ascii="Arial" w:hAnsi="Arial" w:cs="Arial"/>
-          <w:lang w:val="es-MX"/>
-        </w:rPr>
-        <w:t xml:space="preserve"> </w:t>
+        <w:t xml:space="preserve"> cada seis meses o cada año, lo cual puede ser realizado por un estudiante de semestres superiores siguiendo la documentación del código fuente. El proceso está documentado y no requiere conocimientos avanzados. </w:t>
       </w:r>
     </w:p>
     <w:p>
@@ -6430,14 +6560,7 @@
           <w:rFonts w:ascii="Arial" w:hAnsi="Arial" w:cs="Arial"/>
           <w:lang w:val="es-MX"/>
         </w:rPr>
-        <w:t>E</w:t>
-      </w:r>
-      <w:r>
-        <w:rPr>
-          <w:rFonts w:ascii="Arial" w:hAnsi="Arial" w:cs="Arial"/>
-          <w:lang w:val="es-MX"/>
-        </w:rPr>
-        <w:t xml:space="preserve">l </w:t>
+        <w:t xml:space="preserve">El </w:t>
       </w:r>
       <w:proofErr w:type="spellStart"/>
       <w:r>
@@ -6475,38 +6598,22 @@
           <w:rFonts w:ascii="Arial" w:hAnsi="Arial" w:cs="Arial"/>
           <w:lang w:val="es-MX"/>
         </w:rPr>
-        <w:t>E</w:t>
+        <w:t>El código fuente está alojado en GitHub bajo control de versiones, accesible para cualquier estudiante</w:t>
       </w:r>
       <w:r>
         <w:rPr>
           <w:rFonts w:ascii="Arial" w:hAnsi="Arial" w:cs="Arial"/>
           <w:lang w:val="es-MX"/>
         </w:rPr>
-        <w:t>l código fuente está alojado en GitHub bajo control de versiones, accesible para cualquier estudiante o docente que desee realizar mejoras o correcciones.</w:t>
-      </w:r>
-    </w:p>
-    <w:p>
-      <w:pPr>
-        <w:ind w:left="284"/>
-        <w:jc w:val="both"/>
-        <w:rPr>
-          <w:rFonts w:ascii="Arial" w:hAnsi="Arial" w:cs="Arial"/>
-          <w:b/>
-          <w:bCs/>
+        <w:t xml:space="preserve">, docente, ingeniero, programador, y/o interesado </w:t>
+      </w:r>
+      <w:r>
+        <w:rPr>
+          <w:rFonts w:ascii="Arial" w:hAnsi="Arial" w:cs="Arial"/>
           <w:lang w:val="es-MX"/>
         </w:rPr>
-      </w:pPr>
-    </w:p>
-    <w:p>
-      <w:pPr>
-        <w:pStyle w:val="Default"/>
-        <w:jc w:val="both"/>
-        <w:rPr>
-          <w:rFonts w:ascii="Arial" w:hAnsi="Arial" w:cs="Arial"/>
-          <w:sz w:val="22"/>
-          <w:szCs w:val="22"/>
-        </w:rPr>
-      </w:pPr>
+        <w:t>que desee realizar mejoras o correcciones.</w:t>
+      </w:r>
     </w:p>
     <w:p>
       <w:pPr>
@@ -6765,7 +6872,7 @@
           <w:sz w:val="22"/>
           <w:szCs w:val="22"/>
         </w:rPr>
-        <w:t xml:space="preserve">Actualmente, el acceso a información privilegiada sobre el mercado laboral (salarios, tendencias, oportunidades) suele estar mediado por redes sociales y contactos personales. Los estudiantes con mayores conexiones tienen ventaja. El proyecto </w:t>
+        <w:t xml:space="preserve">Actualmente, el acceso a información privilegiada sobre el mercado laboral (salarios, tendencias, oportunidades) suele estar mediado por redes sociales y contactos personales. Los estudiantes con mayores conexiones tienen ventaja. El proyecto democratiza el acceso a esta información, nivelando las oportunidades para todos los estudiantes, independientemente de su origen socioeconómico o su red de </w:t>
       </w:r>
       <w:r>
         <w:rPr>
@@ -6776,7 +6883,7 @@
           <w:szCs w:val="22"/>
         </w:rPr>
         <w:lastRenderedPageBreak/>
-        <w:t>democratiza el acceso a esta información, nivelando las oportunidades para todos los estudiantes, independientemente de su origen socioeconómico o su red de contactos. Esto contribuye a una mayor equidad en la inserción laboral de los egresados.</w:t>
+        <w:t>contactos. Esto contribuye a una mayor equidad en la inserción laboral de los egresados.</w:t>
       </w:r>
     </w:p>
     <w:p>
@@ -7213,7 +7320,6 @@
           <w:sz w:val="22"/>
           <w:szCs w:val="22"/>
         </w:rPr>
-        <w:lastRenderedPageBreak/>
         <w:t xml:space="preserve">Disponibilidad de información apropiada: </w:t>
       </w:r>
       <w:r>
@@ -7243,6 +7349,7 @@
           <w:sz w:val="22"/>
           <w:szCs w:val="22"/>
         </w:rPr>
+        <w:lastRenderedPageBreak/>
         <w:t>Beneficios Intangibles</w:t>
       </w:r>
       <w:r>
@@ -7394,7 +7501,6 @@
               <w:bottom w:val="single" w:sz="4" w:space="0" w:color="auto"/>
               <w:right w:val="single" w:sz="4" w:space="0" w:color="auto"/>
             </w:tcBorders>
-            <w:shd w:val="clear" w:color="auto" w:fill="auto"/>
             <w:vAlign w:val="center"/>
             <w:hideMark/>
           </w:tcPr>
@@ -7427,7 +7533,6 @@
               <w:bottom w:val="single" w:sz="4" w:space="0" w:color="auto"/>
               <w:right w:val="single" w:sz="4" w:space="0" w:color="auto"/>
             </w:tcBorders>
-            <w:shd w:val="clear" w:color="auto" w:fill="auto"/>
             <w:vAlign w:val="center"/>
             <w:hideMark/>
           </w:tcPr>
@@ -7466,7 +7571,6 @@
               <w:bottom w:val="single" w:sz="4" w:space="0" w:color="auto"/>
               <w:right w:val="single" w:sz="4" w:space="0" w:color="auto"/>
             </w:tcBorders>
-            <w:shd w:val="clear" w:color="auto" w:fill="auto"/>
             <w:vAlign w:val="center"/>
             <w:hideMark/>
           </w:tcPr>
@@ -7499,7 +7603,6 @@
               <w:bottom w:val="single" w:sz="4" w:space="0" w:color="auto"/>
               <w:right w:val="single" w:sz="4" w:space="0" w:color="auto"/>
             </w:tcBorders>
-            <w:shd w:val="clear" w:color="auto" w:fill="auto"/>
             <w:vAlign w:val="center"/>
             <w:hideMark/>
           </w:tcPr>
@@ -7554,7 +7657,6 @@
               <w:bottom w:val="single" w:sz="4" w:space="0" w:color="auto"/>
               <w:right w:val="single" w:sz="4" w:space="0" w:color="auto"/>
             </w:tcBorders>
-            <w:shd w:val="clear" w:color="auto" w:fill="auto"/>
             <w:vAlign w:val="center"/>
             <w:hideMark/>
           </w:tcPr>
@@ -7587,7 +7689,6 @@
               <w:bottom w:val="single" w:sz="4" w:space="0" w:color="auto"/>
               <w:right w:val="single" w:sz="4" w:space="0" w:color="auto"/>
             </w:tcBorders>
-            <w:shd w:val="clear" w:color="auto" w:fill="auto"/>
             <w:vAlign w:val="center"/>
             <w:hideMark/>
           </w:tcPr>
@@ -7626,7 +7727,6 @@
               <w:bottom w:val="single" w:sz="4" w:space="0" w:color="auto"/>
               <w:right w:val="single" w:sz="4" w:space="0" w:color="auto"/>
             </w:tcBorders>
-            <w:shd w:val="clear" w:color="auto" w:fill="auto"/>
             <w:vAlign w:val="center"/>
             <w:hideMark/>
           </w:tcPr>
@@ -7659,7 +7759,6 @@
               <w:bottom w:val="single" w:sz="4" w:space="0" w:color="auto"/>
               <w:right w:val="single" w:sz="4" w:space="0" w:color="auto"/>
             </w:tcBorders>
-            <w:shd w:val="clear" w:color="auto" w:fill="auto"/>
             <w:vAlign w:val="center"/>
             <w:hideMark/>
           </w:tcPr>
@@ -7698,7 +7797,6 @@
               <w:bottom w:val="single" w:sz="4" w:space="0" w:color="auto"/>
               <w:right w:val="single" w:sz="4" w:space="0" w:color="auto"/>
             </w:tcBorders>
-            <w:shd w:val="clear" w:color="auto" w:fill="auto"/>
             <w:vAlign w:val="center"/>
             <w:hideMark/>
           </w:tcPr>
@@ -7731,7 +7829,6 @@
               <w:bottom w:val="single" w:sz="4" w:space="0" w:color="auto"/>
               <w:right w:val="single" w:sz="4" w:space="0" w:color="auto"/>
             </w:tcBorders>
-            <w:shd w:val="clear" w:color="auto" w:fill="auto"/>
             <w:vAlign w:val="center"/>
             <w:hideMark/>
           </w:tcPr>
@@ -7899,7 +7996,6 @@
               <w:bottom w:val="single" w:sz="4" w:space="0" w:color="auto"/>
               <w:right w:val="single" w:sz="4" w:space="0" w:color="auto"/>
             </w:tcBorders>
-            <w:shd w:val="clear" w:color="auto" w:fill="auto"/>
             <w:noWrap/>
             <w:vAlign w:val="bottom"/>
             <w:hideMark/>
@@ -7933,7 +8029,6 @@
               <w:bottom w:val="single" w:sz="4" w:space="0" w:color="auto"/>
               <w:right w:val="single" w:sz="4" w:space="0" w:color="auto"/>
             </w:tcBorders>
-            <w:shd w:val="clear" w:color="auto" w:fill="auto"/>
             <w:noWrap/>
             <w:vAlign w:val="bottom"/>
             <w:hideMark/>
@@ -7967,7 +8062,6 @@
               <w:bottom w:val="single" w:sz="4" w:space="0" w:color="auto"/>
               <w:right w:val="single" w:sz="4" w:space="0" w:color="auto"/>
             </w:tcBorders>
-            <w:shd w:val="clear" w:color="auto" w:fill="auto"/>
             <w:noWrap/>
             <w:vAlign w:val="bottom"/>
             <w:hideMark/>
@@ -8007,7 +8101,6 @@
               <w:bottom w:val="single" w:sz="4" w:space="0" w:color="auto"/>
               <w:right w:val="single" w:sz="4" w:space="0" w:color="auto"/>
             </w:tcBorders>
-            <w:shd w:val="clear" w:color="auto" w:fill="auto"/>
             <w:noWrap/>
             <w:vAlign w:val="bottom"/>
             <w:hideMark/>
@@ -8041,7 +8134,6 @@
               <w:bottom w:val="single" w:sz="4" w:space="0" w:color="auto"/>
               <w:right w:val="single" w:sz="4" w:space="0" w:color="auto"/>
             </w:tcBorders>
-            <w:shd w:val="clear" w:color="auto" w:fill="auto"/>
             <w:noWrap/>
             <w:vAlign w:val="bottom"/>
             <w:hideMark/>
@@ -8075,7 +8167,6 @@
               <w:bottom w:val="single" w:sz="4" w:space="0" w:color="auto"/>
               <w:right w:val="single" w:sz="4" w:space="0" w:color="auto"/>
             </w:tcBorders>
-            <w:shd w:val="clear" w:color="auto" w:fill="auto"/>
             <w:noWrap/>
             <w:vAlign w:val="bottom"/>
             <w:hideMark/>
@@ -8123,7 +8214,6 @@
               <w:bottom w:val="single" w:sz="4" w:space="0" w:color="auto"/>
               <w:right w:val="single" w:sz="4" w:space="0" w:color="auto"/>
             </w:tcBorders>
-            <w:shd w:val="clear" w:color="auto" w:fill="auto"/>
             <w:noWrap/>
             <w:vAlign w:val="bottom"/>
             <w:hideMark/>
@@ -8157,7 +8247,6 @@
               <w:bottom w:val="single" w:sz="4" w:space="0" w:color="auto"/>
               <w:right w:val="single" w:sz="4" w:space="0" w:color="auto"/>
             </w:tcBorders>
-            <w:shd w:val="clear" w:color="auto" w:fill="auto"/>
             <w:noWrap/>
             <w:vAlign w:val="bottom"/>
             <w:hideMark/>
@@ -8191,7 +8280,6 @@
               <w:bottom w:val="single" w:sz="4" w:space="0" w:color="auto"/>
               <w:right w:val="single" w:sz="4" w:space="0" w:color="auto"/>
             </w:tcBorders>
-            <w:shd w:val="clear" w:color="auto" w:fill="auto"/>
             <w:noWrap/>
             <w:vAlign w:val="bottom"/>
             <w:hideMark/>
@@ -8231,7 +8319,6 @@
               <w:bottom w:val="single" w:sz="4" w:space="0" w:color="auto"/>
               <w:right w:val="single" w:sz="4" w:space="0" w:color="auto"/>
             </w:tcBorders>
-            <w:shd w:val="clear" w:color="auto" w:fill="auto"/>
             <w:noWrap/>
             <w:vAlign w:val="bottom"/>
             <w:hideMark/>
@@ -8265,7 +8352,6 @@
               <w:bottom w:val="single" w:sz="4" w:space="0" w:color="auto"/>
               <w:right w:val="single" w:sz="4" w:space="0" w:color="auto"/>
             </w:tcBorders>
-            <w:shd w:val="clear" w:color="auto" w:fill="auto"/>
             <w:noWrap/>
             <w:vAlign w:val="bottom"/>
             <w:hideMark/>
@@ -8307,7 +8393,6 @@
               <w:bottom w:val="single" w:sz="4" w:space="0" w:color="auto"/>
               <w:right w:val="single" w:sz="4" w:space="0" w:color="auto"/>
             </w:tcBorders>
-            <w:shd w:val="clear" w:color="auto" w:fill="auto"/>
             <w:noWrap/>
             <w:vAlign w:val="bottom"/>
             <w:hideMark/>
@@ -8395,7 +8480,6 @@
           <w:sz w:val="22"/>
           <w:szCs w:val="22"/>
         </w:rPr>
-        <w:lastRenderedPageBreak/>
         <w:t>Este valor es aceptable y demuestra que el proyecto es financieramente viable incluso considerando únicamente el beneficio más conservador (ahorro en consultorías externas).</w:t>
       </w:r>
     </w:p>
@@ -8440,6 +8524,7 @@
           <w:sz w:val="22"/>
           <w:szCs w:val="22"/>
         </w:rPr>
+        <w:lastRenderedPageBreak/>
         <w:t xml:space="preserve">El Valor Actual Neto (VAN) calculado para el proyecto </w:t>
       </w:r>
       <w:proofErr w:type="spellStart"/>
@@ -8738,25 +8823,7 @@
           <w:iCs/>
           <w:color w:val="000000"/>
         </w:rPr>
-        <w:t xml:space="preserve">El proyecto es técnicamente factible. El hardware necesario (computadora personal del estudiante o equipos de los laboratorios de la facultad) ya está disponible y cumple con los requisitos mínimos. El software requerido (Python, Pandas, SQLite, </w:t>
-      </w:r>
-      <w:proofErr w:type="spellStart"/>
-      <w:r>
-        <w:rPr>
-          <w:rFonts w:ascii="Arial" w:hAnsi="Arial" w:cs="Arial"/>
-          <w:iCs/>
-          <w:color w:val="000000"/>
-        </w:rPr>
-        <w:t>Power</w:t>
-      </w:r>
-      <w:proofErr w:type="spellEnd"/>
-      <w:r>
-        <w:rPr>
-          <w:rFonts w:ascii="Arial" w:hAnsi="Arial" w:cs="Arial"/>
-          <w:iCs/>
-          <w:color w:val="000000"/>
-        </w:rPr>
-        <w:t xml:space="preserve"> BI Desktop, GitHub) es gratuito y de fácil acceso. Los conocimientos necesarios para el desarrollo están al alcance del estudiante, quien los ha adquirido durante su formación en Ingeniería de Sistemas. No se requiere inversión en infraestructura informática adicional.</w:t>
+        <w:t>El proyecto es técnicamente factible. El hardware necesario (computadora personal del estudiante o equipos de los laboratorios de la facultad) ya está disponible y cumple con los requisitos mínimos. El software requerido (Python, Pandas, SQLite, Power BI Desktop, GitHub) es gratuito y de fácil acceso. Los conocimientos necesarios para el desarrollo están al alcance del estudiante, quien los ha adquirido durante su formación en Ingeniería de Sistemas. No se requiere inversión en infraestructura informática adicional.</w:t>
       </w:r>
     </w:p>
     <w:p>
@@ -8842,7 +8909,6 @@
               <w:bottom w:val="single" w:sz="4" w:space="0" w:color="auto"/>
               <w:right w:val="single" w:sz="4" w:space="0" w:color="auto"/>
             </w:tcBorders>
-            <w:shd w:val="clear" w:color="auto" w:fill="auto"/>
             <w:noWrap/>
             <w:vAlign w:val="center"/>
             <w:hideMark/>
@@ -8876,7 +8942,6 @@
               <w:bottom w:val="single" w:sz="4" w:space="0" w:color="auto"/>
               <w:right w:val="single" w:sz="4" w:space="0" w:color="auto"/>
             </w:tcBorders>
-            <w:shd w:val="clear" w:color="auto" w:fill="auto"/>
             <w:noWrap/>
             <w:vAlign w:val="center"/>
             <w:hideMark/>
@@ -8910,7 +8975,6 @@
               <w:bottom w:val="single" w:sz="4" w:space="0" w:color="auto"/>
               <w:right w:val="single" w:sz="4" w:space="0" w:color="auto"/>
             </w:tcBorders>
-            <w:shd w:val="clear" w:color="auto" w:fill="auto"/>
             <w:noWrap/>
             <w:vAlign w:val="center"/>
             <w:hideMark/>
@@ -8950,7 +9014,6 @@
               <w:bottom w:val="single" w:sz="4" w:space="0" w:color="auto"/>
               <w:right w:val="single" w:sz="4" w:space="0" w:color="auto"/>
             </w:tcBorders>
-            <w:shd w:val="clear" w:color="auto" w:fill="auto"/>
             <w:noWrap/>
             <w:vAlign w:val="center"/>
             <w:hideMark/>
@@ -8984,7 +9047,6 @@
               <w:bottom w:val="single" w:sz="4" w:space="0" w:color="auto"/>
               <w:right w:val="single" w:sz="4" w:space="0" w:color="auto"/>
             </w:tcBorders>
-            <w:shd w:val="clear" w:color="auto" w:fill="auto"/>
             <w:noWrap/>
             <w:vAlign w:val="center"/>
             <w:hideMark/>
@@ -9018,7 +9080,6 @@
               <w:bottom w:val="single" w:sz="4" w:space="0" w:color="auto"/>
               <w:right w:val="single" w:sz="4" w:space="0" w:color="auto"/>
             </w:tcBorders>
-            <w:shd w:val="clear" w:color="auto" w:fill="auto"/>
             <w:noWrap/>
             <w:vAlign w:val="center"/>
             <w:hideMark/>
@@ -9058,7 +9119,6 @@
               <w:bottom w:val="single" w:sz="4" w:space="0" w:color="auto"/>
               <w:right w:val="single" w:sz="4" w:space="0" w:color="auto"/>
             </w:tcBorders>
-            <w:shd w:val="clear" w:color="auto" w:fill="auto"/>
             <w:noWrap/>
             <w:vAlign w:val="center"/>
             <w:hideMark/>
@@ -9092,7 +9152,6 @@
               <w:bottom w:val="single" w:sz="4" w:space="0" w:color="auto"/>
               <w:right w:val="single" w:sz="4" w:space="0" w:color="auto"/>
             </w:tcBorders>
-            <w:shd w:val="clear" w:color="auto" w:fill="auto"/>
             <w:noWrap/>
             <w:vAlign w:val="center"/>
             <w:hideMark/>
@@ -9126,7 +9185,6 @@
               <w:bottom w:val="single" w:sz="4" w:space="0" w:color="auto"/>
               <w:right w:val="single" w:sz="4" w:space="0" w:color="auto"/>
             </w:tcBorders>
-            <w:shd w:val="clear" w:color="auto" w:fill="auto"/>
             <w:noWrap/>
             <w:vAlign w:val="center"/>
             <w:hideMark/>
@@ -9166,7 +9224,6 @@
               <w:bottom w:val="single" w:sz="4" w:space="0" w:color="auto"/>
               <w:right w:val="single" w:sz="4" w:space="0" w:color="auto"/>
             </w:tcBorders>
-            <w:shd w:val="clear" w:color="auto" w:fill="auto"/>
             <w:noWrap/>
             <w:vAlign w:val="center"/>
             <w:hideMark/>
@@ -9200,7 +9257,6 @@
               <w:bottom w:val="single" w:sz="4" w:space="0" w:color="auto"/>
               <w:right w:val="single" w:sz="4" w:space="0" w:color="auto"/>
             </w:tcBorders>
-            <w:shd w:val="clear" w:color="auto" w:fill="auto"/>
             <w:noWrap/>
             <w:vAlign w:val="center"/>
             <w:hideMark/>
@@ -9234,7 +9290,6 @@
               <w:bottom w:val="single" w:sz="4" w:space="0" w:color="auto"/>
               <w:right w:val="single" w:sz="4" w:space="0" w:color="auto"/>
             </w:tcBorders>
-            <w:shd w:val="clear" w:color="auto" w:fill="auto"/>
             <w:noWrap/>
             <w:vAlign w:val="center"/>
             <w:hideMark/>
@@ -9420,7 +9475,7 @@
 </file>
 
 <file path=word/endnotes.xml><?xml version="1.0" encoding="utf-8"?>
-<w:endnotes xmlns:wpc="http://schemas.microsoft.com/office/word/2010/wordprocessingCanvas" xmlns:cx="http://schemas.microsoft.com/office/drawing/2014/chartex" xmlns:cx1="http://schemas.microsoft.com/office/drawing/2015/9/8/chartex" xmlns:cx2="http://schemas.microsoft.com/office/drawing/2015/10/21/chartex" xmlns:cx3="http://schemas.microsoft.com/office/drawing/2016/5/9/chartex" xmlns:cx4="http://schemas.microsoft.com/office/drawing/2016/5/10/chartex" xmlns:cx5="http://schemas.microsoft.com/office/drawing/2016/5/11/chartex" xmlns:cx6="http://schemas.microsoft.com/office/drawing/2016/5/12/chartex" xmlns:cx7="http://schemas.microsoft.com/office/drawing/2016/5/13/chartex" xmlns:cx8="http://schemas.microsoft.com/office/drawing/2016/5/14/chartex" xmlns:mc="http://schemas.openxmlformats.org/markup-compatibility/2006" xmlns:aink="http://schemas.microsoft.com/office/drawing/2016/ink" xmlns:am3d="http://schemas.microsoft.com/office/drawing/2017/model3d" xmlns:o="urn:schemas-microsoft-com:office:office" xmlns:r="http://schemas.openxmlformats.org/officeDocument/2006/relationships" xmlns:m="http://schemas.openxmlformats.org/officeDocument/2006/math" xmlns:v="urn:schemas-microsoft-com:vml" xmlns:wp14="http://schemas.microsoft.com/office/word/2010/wordprocessingDrawing" xmlns:wp="http://schemas.openxmlformats.org/drawingml/2006/wordprocessingDrawing" xmlns:w10="urn:schemas-microsoft-com:office:word" xmlns:w="http://schemas.openxmlformats.org/wordprocessingml/2006/main" xmlns:w14="http://schemas.microsoft.com/office/word/2010/wordml" xmlns:w15="http://schemas.microsoft.com/office/word/2012/wordml" xmlns:w16cex="http://schemas.microsoft.com/office/word/2018/wordml/cex" xmlns:w16cid="http://schemas.microsoft.com/office/word/2016/wordml/cid" xmlns:w16="http://schemas.microsoft.com/office/word/2018/wordml" xmlns:w16sdtdh="http://schemas.microsoft.com/office/word/2020/wordml/sdtdatahash" xmlns:w16se="http://schemas.microsoft.com/office/word/2015/wordml/symex" xmlns:wpg="http://schemas.microsoft.com/office/word/2010/wordprocessingGroup" xmlns:wpi="http://schemas.microsoft.com/office/word/2010/wordprocessingInk" xmlns:wne="http://schemas.microsoft.com/office/word/2006/wordml" xmlns:wps="http://schemas.microsoft.com/office/word/2010/wordprocessingShape" mc:Ignorable="w14 w15 w16se w16cid w16 w16cex w16sdtdh wp14">
+<w:endnotes xmlns:wpc="http://schemas.microsoft.com/office/word/2010/wordprocessingCanvas" xmlns:cx="http://schemas.microsoft.com/office/drawing/2014/chartex" xmlns:cx1="http://schemas.microsoft.com/office/drawing/2015/9/8/chartex" xmlns:cx2="http://schemas.microsoft.com/office/drawing/2015/10/21/chartex" xmlns:cx3="http://schemas.microsoft.com/office/drawing/2016/5/9/chartex" xmlns:cx4="http://schemas.microsoft.com/office/drawing/2016/5/10/chartex" xmlns:cx5="http://schemas.microsoft.com/office/drawing/2016/5/11/chartex" xmlns:cx6="http://schemas.microsoft.com/office/drawing/2016/5/12/chartex" xmlns:cx7="http://schemas.microsoft.com/office/drawing/2016/5/13/chartex" xmlns:cx8="http://schemas.microsoft.com/office/drawing/2016/5/14/chartex" xmlns:mc="http://schemas.openxmlformats.org/markup-compatibility/2006" xmlns:aink="http://schemas.microsoft.com/office/drawing/2016/ink" xmlns:am3d="http://schemas.microsoft.com/office/drawing/2017/model3d" xmlns:o="urn:schemas-microsoft-com:office:office" xmlns:oel="http://schemas.microsoft.com/office/2019/extlst" xmlns:r="http://schemas.openxmlformats.org/officeDocument/2006/relationships" xmlns:m="http://schemas.openxmlformats.org/officeDocument/2006/math" xmlns:v="urn:schemas-microsoft-com:vml" xmlns:wp14="http://schemas.microsoft.com/office/word/2010/wordprocessingDrawing" xmlns:wp="http://schemas.openxmlformats.org/drawingml/2006/wordprocessingDrawing" xmlns:w10="urn:schemas-microsoft-com:office:word" xmlns:w="http://schemas.openxmlformats.org/wordprocessingml/2006/main" xmlns:w14="http://schemas.microsoft.com/office/word/2010/wordml" xmlns:w15="http://schemas.microsoft.com/office/word/2012/wordml" xmlns:w16cex="http://schemas.microsoft.com/office/word/2018/wordml/cex" xmlns:w16cid="http://schemas.microsoft.com/office/word/2016/wordml/cid" xmlns:w16="http://schemas.microsoft.com/office/word/2018/wordml" xmlns:w16du="http://schemas.microsoft.com/office/word/2023/wordml/word16du" xmlns:w16sdtdh="http://schemas.microsoft.com/office/word/2020/wordml/sdtdatahash" xmlns:w16sdtfl="http://schemas.microsoft.com/office/word/2024/wordml/sdtformatlock" xmlns:w16se="http://schemas.microsoft.com/office/word/2015/wordml/symex" xmlns:wpg="http://schemas.microsoft.com/office/word/2010/wordprocessingGroup" xmlns:wpi="http://schemas.microsoft.com/office/word/2010/wordprocessingInk" xmlns:wne="http://schemas.microsoft.com/office/word/2006/wordml" xmlns:wps="http://schemas.microsoft.com/office/word/2010/wordprocessingShape" mc:Ignorable="w14 w15 w16se w16cid w16 w16cex w16sdtdh w16sdtfl w16du wp14">
   <w:endnote w:type="separator" w:id="-1">
     <w:p>
       <w:pPr>
@@ -9445,7 +9500,7 @@
 </file>
 
 <file path=word/footer1.xml><?xml version="1.0" encoding="utf-8"?>
-<w:ftr xmlns:wpc="http://schemas.microsoft.com/office/word/2010/wordprocessingCanvas" xmlns:cx="http://schemas.microsoft.com/office/drawing/2014/chartex" xmlns:cx1="http://schemas.microsoft.com/office/drawing/2015/9/8/chartex" xmlns:cx2="http://schemas.microsoft.com/office/drawing/2015/10/21/chartex" xmlns:cx3="http://schemas.microsoft.com/office/drawing/2016/5/9/chartex" xmlns:cx4="http://schemas.microsoft.com/office/drawing/2016/5/10/chartex" xmlns:cx5="http://schemas.microsoft.com/office/drawing/2016/5/11/chartex" xmlns:cx6="http://schemas.microsoft.com/office/drawing/2016/5/12/chartex" xmlns:cx7="http://schemas.microsoft.com/office/drawing/2016/5/13/chartex" xmlns:cx8="http://schemas.microsoft.com/office/drawing/2016/5/14/chartex" xmlns:mc="http://schemas.openxmlformats.org/markup-compatibility/2006" xmlns:aink="http://schemas.microsoft.com/office/drawing/2016/ink" xmlns:am3d="http://schemas.microsoft.com/office/drawing/2017/model3d" xmlns:o="urn:schemas-microsoft-com:office:office" xmlns:r="http://schemas.openxmlformats.org/officeDocument/2006/relationships" xmlns:m="http://schemas.openxmlformats.org/officeDocument/2006/math" xmlns:v="urn:schemas-microsoft-com:vml" xmlns:wp14="http://schemas.microsoft.com/office/word/2010/wordprocessingDrawing" xmlns:wp="http://schemas.openxmlformats.org/drawingml/2006/wordprocessingDrawing" xmlns:w10="urn:schemas-microsoft-com:office:word" xmlns:w="http://schemas.openxmlformats.org/wordprocessingml/2006/main" xmlns:w14="http://schemas.microsoft.com/office/word/2010/wordml" xmlns:w15="http://schemas.microsoft.com/office/word/2012/wordml" xmlns:w16cex="http://schemas.microsoft.com/office/word/2018/wordml/cex" xmlns:w16cid="http://schemas.microsoft.com/office/word/2016/wordml/cid" xmlns:w16="http://schemas.microsoft.com/office/word/2018/wordml" xmlns:w16sdtdh="http://schemas.microsoft.com/office/word/2020/wordml/sdtdatahash" xmlns:w16se="http://schemas.microsoft.com/office/word/2015/wordml/symex" xmlns:wpg="http://schemas.microsoft.com/office/word/2010/wordprocessingGroup" xmlns:wpi="http://schemas.microsoft.com/office/word/2010/wordprocessingInk" xmlns:wne="http://schemas.microsoft.com/office/word/2006/wordml" xmlns:wps="http://schemas.microsoft.com/office/word/2010/wordprocessingShape" mc:Ignorable="w14 w15 w16se w16cid w16 w16cex w16sdtdh wp14">
+<w:ftr xmlns:wpc="http://schemas.microsoft.com/office/word/2010/wordprocessingCanvas" xmlns:cx="http://schemas.microsoft.com/office/drawing/2014/chartex" xmlns:cx1="http://schemas.microsoft.com/office/drawing/2015/9/8/chartex" xmlns:cx2="http://schemas.microsoft.com/office/drawing/2015/10/21/chartex" xmlns:cx3="http://schemas.microsoft.com/office/drawing/2016/5/9/chartex" xmlns:cx4="http://schemas.microsoft.com/office/drawing/2016/5/10/chartex" xmlns:cx5="http://schemas.microsoft.com/office/drawing/2016/5/11/chartex" xmlns:cx6="http://schemas.microsoft.com/office/drawing/2016/5/12/chartex" xmlns:cx7="http://schemas.microsoft.com/office/drawing/2016/5/13/chartex" xmlns:cx8="http://schemas.microsoft.com/office/drawing/2016/5/14/chartex" xmlns:mc="http://schemas.openxmlformats.org/markup-compatibility/2006" xmlns:aink="http://schemas.microsoft.com/office/drawing/2016/ink" xmlns:am3d="http://schemas.microsoft.com/office/drawing/2017/model3d" xmlns:o="urn:schemas-microsoft-com:office:office" xmlns:oel="http://schemas.microsoft.com/office/2019/extlst" xmlns:r="http://schemas.openxmlformats.org/officeDocument/2006/relationships" xmlns:m="http://schemas.openxmlformats.org/officeDocument/2006/math" xmlns:v="urn:schemas-microsoft-com:vml" xmlns:wp14="http://schemas.microsoft.com/office/word/2010/wordprocessingDrawing" xmlns:wp="http://schemas.openxmlformats.org/drawingml/2006/wordprocessingDrawing" xmlns:w10="urn:schemas-microsoft-com:office:word" xmlns:w="http://schemas.openxmlformats.org/wordprocessingml/2006/main" xmlns:w14="http://schemas.microsoft.com/office/word/2010/wordml" xmlns:w15="http://schemas.microsoft.com/office/word/2012/wordml" xmlns:w16cex="http://schemas.microsoft.com/office/word/2018/wordml/cex" xmlns:w16cid="http://schemas.microsoft.com/office/word/2016/wordml/cid" xmlns:w16="http://schemas.microsoft.com/office/word/2018/wordml" xmlns:w16du="http://schemas.microsoft.com/office/word/2023/wordml/word16du" xmlns:w16sdtdh="http://schemas.microsoft.com/office/word/2020/wordml/sdtdatahash" xmlns:w16sdtfl="http://schemas.microsoft.com/office/word/2024/wordml/sdtformatlock" xmlns:w16se="http://schemas.microsoft.com/office/word/2015/wordml/symex" xmlns:wpg="http://schemas.microsoft.com/office/word/2010/wordprocessingGroup" xmlns:wpi="http://schemas.microsoft.com/office/word/2010/wordprocessingInk" xmlns:wne="http://schemas.microsoft.com/office/word/2006/wordml" xmlns:wps="http://schemas.microsoft.com/office/word/2010/wordprocessingShape" mc:Ignorable="w14 w15 w16se w16cid w16 w16cex w16sdtdh w16sdtfl w16du wp14">
   <w:sdt>
     <w:sdtPr>
       <w:id w:val="-1014383162"/>
@@ -9454,7 +9509,6 @@
         <w:docPartUnique/>
       </w:docPartObj>
     </w:sdtPr>
-    <w:sdtEndPr/>
     <w:sdtContent>
       <w:p>
         <w:pPr>
@@ -9492,7 +9546,7 @@
 </file>
 
 <file path=word/footnotes.xml><?xml version="1.0" encoding="utf-8"?>
-<w:footnotes xmlns:wpc="http://schemas.microsoft.com/office/word/2010/wordprocessingCanvas" xmlns:cx="http://schemas.microsoft.com/office/drawing/2014/chartex" xmlns:cx1="http://schemas.microsoft.com/office/drawing/2015/9/8/chartex" xmlns:cx2="http://schemas.microsoft.com/office/drawing/2015/10/21/chartex" xmlns:cx3="http://schemas.microsoft.com/office/drawing/2016/5/9/chartex" xmlns:cx4="http://schemas.microsoft.com/office/drawing/2016/5/10/chartex" xmlns:cx5="http://schemas.microsoft.com/office/drawing/2016/5/11/chartex" xmlns:cx6="http://schemas.microsoft.com/office/drawing/2016/5/12/chartex" xmlns:cx7="http://schemas.microsoft.com/office/drawing/2016/5/13/chartex" xmlns:cx8="http://schemas.microsoft.com/office/drawing/2016/5/14/chartex" xmlns:mc="http://schemas.openxmlformats.org/markup-compatibility/2006" xmlns:aink="http://schemas.microsoft.com/office/drawing/2016/ink" xmlns:am3d="http://schemas.microsoft.com/office/drawing/2017/model3d" xmlns:o="urn:schemas-microsoft-com:office:office" xmlns:r="http://schemas.openxmlformats.org/officeDocument/2006/relationships" xmlns:m="http://schemas.openxmlformats.org/officeDocument/2006/math" xmlns:v="urn:schemas-microsoft-com:vml" xmlns:wp14="http://schemas.microsoft.com/office/word/2010/wordprocessingDrawing" xmlns:wp="http://schemas.openxmlformats.org/drawingml/2006/wordprocessingDrawing" xmlns:w10="urn:schemas-microsoft-com:office:word" xmlns:w="http://schemas.openxmlformats.org/wordprocessingml/2006/main" xmlns:w14="http://schemas.microsoft.com/office/word/2010/wordml" xmlns:w15="http://schemas.microsoft.com/office/word/2012/wordml" xmlns:w16cex="http://schemas.microsoft.com/office/word/2018/wordml/cex" xmlns:w16cid="http://schemas.microsoft.com/office/word/2016/wordml/cid" xmlns:w16="http://schemas.microsoft.com/office/word/2018/wordml" xmlns:w16sdtdh="http://schemas.microsoft.com/office/word/2020/wordml/sdtdatahash" xmlns:w16se="http://schemas.microsoft.com/office/word/2015/wordml/symex" xmlns:wpg="http://schemas.microsoft.com/office/word/2010/wordprocessingGroup" xmlns:wpi="http://schemas.microsoft.com/office/word/2010/wordprocessingInk" xmlns:wne="http://schemas.microsoft.com/office/word/2006/wordml" xmlns:wps="http://schemas.microsoft.com/office/word/2010/wordprocessingShape" mc:Ignorable="w14 w15 w16se w16cid w16 w16cex w16sdtdh wp14">
+<w:footnotes xmlns:wpc="http://schemas.microsoft.com/office/word/2010/wordprocessingCanvas" xmlns:cx="http://schemas.microsoft.com/office/drawing/2014/chartex" xmlns:cx1="http://schemas.microsoft.com/office/drawing/2015/9/8/chartex" xmlns:cx2="http://schemas.microsoft.com/office/drawing/2015/10/21/chartex" xmlns:cx3="http://schemas.microsoft.com/office/drawing/2016/5/9/chartex" xmlns:cx4="http://schemas.microsoft.com/office/drawing/2016/5/10/chartex" xmlns:cx5="http://schemas.microsoft.com/office/drawing/2016/5/11/chartex" xmlns:cx6="http://schemas.microsoft.com/office/drawing/2016/5/12/chartex" xmlns:cx7="http://schemas.microsoft.com/office/drawing/2016/5/13/chartex" xmlns:cx8="http://schemas.microsoft.com/office/drawing/2016/5/14/chartex" xmlns:mc="http://schemas.openxmlformats.org/markup-compatibility/2006" xmlns:aink="http://schemas.microsoft.com/office/drawing/2016/ink" xmlns:am3d="http://schemas.microsoft.com/office/drawing/2017/model3d" xmlns:o="urn:schemas-microsoft-com:office:office" xmlns:oel="http://schemas.microsoft.com/office/2019/extlst" xmlns:r="http://schemas.openxmlformats.org/officeDocument/2006/relationships" xmlns:m="http://schemas.openxmlformats.org/officeDocument/2006/math" xmlns:v="urn:schemas-microsoft-com:vml" xmlns:wp14="http://schemas.microsoft.com/office/word/2010/wordprocessingDrawing" xmlns:wp="http://schemas.openxmlformats.org/drawingml/2006/wordprocessingDrawing" xmlns:w10="urn:schemas-microsoft-com:office:word" xmlns:w="http://schemas.openxmlformats.org/wordprocessingml/2006/main" xmlns:w14="http://schemas.microsoft.com/office/word/2010/wordml" xmlns:w15="http://schemas.microsoft.com/office/word/2012/wordml" xmlns:w16cex="http://schemas.microsoft.com/office/word/2018/wordml/cex" xmlns:w16cid="http://schemas.microsoft.com/office/word/2016/wordml/cid" xmlns:w16="http://schemas.microsoft.com/office/word/2018/wordml" xmlns:w16du="http://schemas.microsoft.com/office/word/2023/wordml/word16du" xmlns:w16sdtdh="http://schemas.microsoft.com/office/word/2020/wordml/sdtdatahash" xmlns:w16sdtfl="http://schemas.microsoft.com/office/word/2024/wordml/sdtformatlock" xmlns:w16se="http://schemas.microsoft.com/office/word/2015/wordml/symex" xmlns:wpg="http://schemas.microsoft.com/office/word/2010/wordprocessingGroup" xmlns:wpi="http://schemas.microsoft.com/office/word/2010/wordprocessingInk" xmlns:wne="http://schemas.microsoft.com/office/word/2006/wordml" xmlns:wps="http://schemas.microsoft.com/office/word/2010/wordprocessingShape" mc:Ignorable="w14 w15 w16se w16cid w16 w16cex w16sdtdh w16sdtfl w16du wp14">
   <w:footnote w:type="separator" w:id="-1">
     <w:p>
       <w:pPr>
@@ -9517,7 +9571,7 @@
 </file>
 
 <file path=word/header1.xml><?xml version="1.0" encoding="utf-8"?>
-<w:hdr xmlns:wpc="http://schemas.microsoft.com/office/word/2010/wordprocessingCanvas" xmlns:cx="http://schemas.microsoft.com/office/drawing/2014/chartex" xmlns:cx1="http://schemas.microsoft.com/office/drawing/2015/9/8/chartex" xmlns:cx2="http://schemas.microsoft.com/office/drawing/2015/10/21/chartex" xmlns:cx3="http://schemas.microsoft.com/office/drawing/2016/5/9/chartex" xmlns:cx4="http://schemas.microsoft.com/office/drawing/2016/5/10/chartex" xmlns:cx5="http://schemas.microsoft.com/office/drawing/2016/5/11/chartex" xmlns:cx6="http://schemas.microsoft.com/office/drawing/2016/5/12/chartex" xmlns:cx7="http://schemas.microsoft.com/office/drawing/2016/5/13/chartex" xmlns:cx8="http://schemas.microsoft.com/office/drawing/2016/5/14/chartex" xmlns:mc="http://schemas.openxmlformats.org/markup-compatibility/2006" xmlns:aink="http://schemas.microsoft.com/office/drawing/2016/ink" xmlns:am3d="http://schemas.microsoft.com/office/drawing/2017/model3d" xmlns:o="urn:schemas-microsoft-com:office:office" xmlns:r="http://schemas.openxmlformats.org/officeDocument/2006/relationships" xmlns:m="http://schemas.openxmlformats.org/officeDocument/2006/math" xmlns:v="urn:schemas-microsoft-com:vml" xmlns:wp14="http://schemas.microsoft.com/office/word/2010/wordprocessingDrawing" xmlns:wp="http://schemas.openxmlformats.org/drawingml/2006/wordprocessingDrawing" xmlns:w10="urn:schemas-microsoft-com:office:word" xmlns:w="http://schemas.openxmlformats.org/wordprocessingml/2006/main" xmlns:w14="http://schemas.microsoft.com/office/word/2010/wordml" xmlns:w15="http://schemas.microsoft.com/office/word/2012/wordml" xmlns:w16cex="http://schemas.microsoft.com/office/word/2018/wordml/cex" xmlns:w16cid="http://schemas.microsoft.com/office/word/2016/wordml/cid" xmlns:w16="http://schemas.microsoft.com/office/word/2018/wordml" xmlns:w16sdtdh="http://schemas.microsoft.com/office/word/2020/wordml/sdtdatahash" xmlns:w16se="http://schemas.microsoft.com/office/word/2015/wordml/symex" xmlns:wpg="http://schemas.microsoft.com/office/word/2010/wordprocessingGroup" xmlns:wpi="http://schemas.microsoft.com/office/word/2010/wordprocessingInk" xmlns:wne="http://schemas.microsoft.com/office/word/2006/wordml" xmlns:wps="http://schemas.microsoft.com/office/word/2010/wordprocessingShape" mc:Ignorable="w14 w15 w16se w16cid w16 w16cex w16sdtdh wp14">
+<w:hdr xmlns:wpc="http://schemas.microsoft.com/office/word/2010/wordprocessingCanvas" xmlns:cx="http://schemas.microsoft.com/office/drawing/2014/chartex" xmlns:cx1="http://schemas.microsoft.com/office/drawing/2015/9/8/chartex" xmlns:cx2="http://schemas.microsoft.com/office/drawing/2015/10/21/chartex" xmlns:cx3="http://schemas.microsoft.com/office/drawing/2016/5/9/chartex" xmlns:cx4="http://schemas.microsoft.com/office/drawing/2016/5/10/chartex" xmlns:cx5="http://schemas.microsoft.com/office/drawing/2016/5/11/chartex" xmlns:cx6="http://schemas.microsoft.com/office/drawing/2016/5/12/chartex" xmlns:cx7="http://schemas.microsoft.com/office/drawing/2016/5/13/chartex" xmlns:cx8="http://schemas.microsoft.com/office/drawing/2016/5/14/chartex" xmlns:mc="http://schemas.openxmlformats.org/markup-compatibility/2006" xmlns:aink="http://schemas.microsoft.com/office/drawing/2016/ink" xmlns:am3d="http://schemas.microsoft.com/office/drawing/2017/model3d" xmlns:o="urn:schemas-microsoft-com:office:office" xmlns:oel="http://schemas.microsoft.com/office/2019/extlst" xmlns:r="http://schemas.openxmlformats.org/officeDocument/2006/relationships" xmlns:m="http://schemas.openxmlformats.org/officeDocument/2006/math" xmlns:v="urn:schemas-microsoft-com:vml" xmlns:wp14="http://schemas.microsoft.com/office/word/2010/wordprocessingDrawing" xmlns:wp="http://schemas.openxmlformats.org/drawingml/2006/wordprocessingDrawing" xmlns:w10="urn:schemas-microsoft-com:office:word" xmlns:w="http://schemas.openxmlformats.org/wordprocessingml/2006/main" xmlns:w14="http://schemas.microsoft.com/office/word/2010/wordml" xmlns:w15="http://schemas.microsoft.com/office/word/2012/wordml" xmlns:w16cex="http://schemas.microsoft.com/office/word/2018/wordml/cex" xmlns:w16cid="http://schemas.microsoft.com/office/word/2016/wordml/cid" xmlns:w16="http://schemas.microsoft.com/office/word/2018/wordml" xmlns:w16du="http://schemas.microsoft.com/office/word/2023/wordml/word16du" xmlns:w16sdtdh="http://schemas.microsoft.com/office/word/2020/wordml/sdtdatahash" xmlns:w16sdtfl="http://schemas.microsoft.com/office/word/2024/wordml/sdtformatlock" xmlns:w16se="http://schemas.microsoft.com/office/word/2015/wordml/symex" xmlns:wpg="http://schemas.microsoft.com/office/word/2010/wordprocessingGroup" xmlns:wpi="http://schemas.microsoft.com/office/word/2010/wordprocessingInk" xmlns:wne="http://schemas.microsoft.com/office/word/2006/wordml" xmlns:wps="http://schemas.microsoft.com/office/word/2010/wordprocessingShape" mc:Ignorable="w14 w15 w16se w16cid w16 w16cex w16sdtdh w16sdtfl w16du wp14">
   <w:p>
     <w:pPr>
       <w:pStyle w:val="Encabezado"/>
@@ -9533,7 +9587,7 @@
 </file>
 
 <file path=word/numbering.xml><?xml version="1.0" encoding="utf-8"?>
-<w:numbering xmlns:wpc="http://schemas.microsoft.com/office/word/2010/wordprocessingCanvas" xmlns:cx="http://schemas.microsoft.com/office/drawing/2014/chartex" xmlns:cx1="http://schemas.microsoft.com/office/drawing/2015/9/8/chartex" xmlns:cx2="http://schemas.microsoft.com/office/drawing/2015/10/21/chartex" xmlns:cx3="http://schemas.microsoft.com/office/drawing/2016/5/9/chartex" xmlns:cx4="http://schemas.microsoft.com/office/drawing/2016/5/10/chartex" xmlns:cx5="http://schemas.microsoft.com/office/drawing/2016/5/11/chartex" xmlns:cx6="http://schemas.microsoft.com/office/drawing/2016/5/12/chartex" xmlns:cx7="http://schemas.microsoft.com/office/drawing/2016/5/13/chartex" xmlns:cx8="http://schemas.microsoft.com/office/drawing/2016/5/14/chartex" xmlns:mc="http://schemas.openxmlformats.org/markup-compatibility/2006" xmlns:aink="http://schemas.microsoft.com/office/drawing/2016/ink" xmlns:am3d="http://schemas.microsoft.com/office/drawing/2017/model3d" xmlns:o="urn:schemas-microsoft-com:office:office" xmlns:r="http://schemas.openxmlformats.org/officeDocument/2006/relationships" xmlns:m="http://schemas.openxmlformats.org/officeDocument/2006/math" xmlns:v="urn:schemas-microsoft-com:vml" xmlns:wp14="http://schemas.microsoft.com/office/word/2010/wordprocessingDrawing" xmlns:wp="http://schemas.openxmlformats.org/drawingml/2006/wordprocessingDrawing" xmlns:w10="urn:schemas-microsoft-com:office:word" xmlns:w="http://schemas.openxmlformats.org/wordprocessingml/2006/main" xmlns:w14="http://schemas.microsoft.com/office/word/2010/wordml" xmlns:w15="http://schemas.microsoft.com/office/word/2012/wordml" xmlns:w16cex="http://schemas.microsoft.com/office/word/2018/wordml/cex" xmlns:w16cid="http://schemas.microsoft.com/office/word/2016/wordml/cid" xmlns:w16="http://schemas.microsoft.com/office/word/2018/wordml" xmlns:w16sdtdh="http://schemas.microsoft.com/office/word/2020/wordml/sdtdatahash" xmlns:w16se="http://schemas.microsoft.com/office/word/2015/wordml/symex" xmlns:wpg="http://schemas.microsoft.com/office/word/2010/wordprocessingGroup" xmlns:wpi="http://schemas.microsoft.com/office/word/2010/wordprocessingInk" xmlns:wne="http://schemas.microsoft.com/office/word/2006/wordml" xmlns:wps="http://schemas.microsoft.com/office/word/2010/wordprocessingShape" mc:Ignorable="w14 w15 w16se w16cid w16 w16cex w16sdtdh wp14">
+<w:numbering xmlns:wpc="http://schemas.microsoft.com/office/word/2010/wordprocessingCanvas" xmlns:cx="http://schemas.microsoft.com/office/drawing/2014/chartex" xmlns:cx1="http://schemas.microsoft.com/office/drawing/2015/9/8/chartex" xmlns:cx2="http://schemas.microsoft.com/office/drawing/2015/10/21/chartex" xmlns:cx3="http://schemas.microsoft.com/office/drawing/2016/5/9/chartex" xmlns:cx4="http://schemas.microsoft.com/office/drawing/2016/5/10/chartex" xmlns:cx5="http://schemas.microsoft.com/office/drawing/2016/5/11/chartex" xmlns:cx6="http://schemas.microsoft.com/office/drawing/2016/5/12/chartex" xmlns:cx7="http://schemas.microsoft.com/office/drawing/2016/5/13/chartex" xmlns:cx8="http://schemas.microsoft.com/office/drawing/2016/5/14/chartex" xmlns:mc="http://schemas.openxmlformats.org/markup-compatibility/2006" xmlns:aink="http://schemas.microsoft.com/office/drawing/2016/ink" xmlns:am3d="http://schemas.microsoft.com/office/drawing/2017/model3d" xmlns:o="urn:schemas-microsoft-com:office:office" xmlns:oel="http://schemas.microsoft.com/office/2019/extlst" xmlns:r="http://schemas.openxmlformats.org/officeDocument/2006/relationships" xmlns:m="http://schemas.openxmlformats.org/officeDocument/2006/math" xmlns:v="urn:schemas-microsoft-com:vml" xmlns:wp14="http://schemas.microsoft.com/office/word/2010/wordprocessingDrawing" xmlns:wp="http://schemas.openxmlformats.org/drawingml/2006/wordprocessingDrawing" xmlns:w10="urn:schemas-microsoft-com:office:word" xmlns:w="http://schemas.openxmlformats.org/wordprocessingml/2006/main" xmlns:w14="http://schemas.microsoft.com/office/word/2010/wordml" xmlns:w15="http://schemas.microsoft.com/office/word/2012/wordml" xmlns:w16cex="http://schemas.microsoft.com/office/word/2018/wordml/cex" xmlns:w16cid="http://schemas.microsoft.com/office/word/2016/wordml/cid" xmlns:w16="http://schemas.microsoft.com/office/word/2018/wordml" xmlns:w16du="http://schemas.microsoft.com/office/word/2023/wordml/word16du" xmlns:w16sdtdh="http://schemas.microsoft.com/office/word/2020/wordml/sdtdatahash" xmlns:w16sdtfl="http://schemas.microsoft.com/office/word/2024/wordml/sdtformatlock" xmlns:w16se="http://schemas.microsoft.com/office/word/2015/wordml/symex" xmlns:wpg="http://schemas.microsoft.com/office/word/2010/wordprocessingGroup" xmlns:wpi="http://schemas.microsoft.com/office/word/2010/wordprocessingInk" xmlns:wne="http://schemas.microsoft.com/office/word/2006/wordml" xmlns:wps="http://schemas.microsoft.com/office/word/2010/wordprocessingShape" mc:Ignorable="w14 w15 w16se w16cid w16 w16cex w16sdtdh w16sdtfl w16du wp14">
   <w:abstractNum w:abstractNumId="0" w15:restartNumberingAfterBreak="0">
     <w:nsid w:val="05E3729F"/>
     <w:multiLevelType w:val="hybridMultilevel"/>
@@ -10889,40 +10943,40 @@
       </w:rPr>
     </w:lvl>
   </w:abstractNum>
-  <w:num w:numId="1">
+  <w:num w:numId="1" w16cid:durableId="1662387892">
     <w:abstractNumId w:val="5"/>
   </w:num>
-  <w:num w:numId="2">
+  <w:num w:numId="2" w16cid:durableId="490296113">
     <w:abstractNumId w:val="10"/>
   </w:num>
-  <w:num w:numId="3">
+  <w:num w:numId="3" w16cid:durableId="1100494525">
     <w:abstractNumId w:val="7"/>
   </w:num>
-  <w:num w:numId="4">
+  <w:num w:numId="4" w16cid:durableId="849025110">
     <w:abstractNumId w:val="9"/>
   </w:num>
-  <w:num w:numId="5">
+  <w:num w:numId="5" w16cid:durableId="946811934">
     <w:abstractNumId w:val="0"/>
   </w:num>
-  <w:num w:numId="6">
+  <w:num w:numId="6" w16cid:durableId="2021658329">
     <w:abstractNumId w:val="1"/>
   </w:num>
-  <w:num w:numId="7">
+  <w:num w:numId="7" w16cid:durableId="969440587">
     <w:abstractNumId w:val="3"/>
   </w:num>
-  <w:num w:numId="8">
+  <w:num w:numId="8" w16cid:durableId="1732802018">
     <w:abstractNumId w:val="8"/>
   </w:num>
-  <w:num w:numId="9">
+  <w:num w:numId="9" w16cid:durableId="1424522982">
     <w:abstractNumId w:val="2"/>
   </w:num>
-  <w:num w:numId="10">
+  <w:num w:numId="10" w16cid:durableId="644745805">
     <w:abstractNumId w:val="11"/>
   </w:num>
-  <w:num w:numId="11">
+  <w:num w:numId="11" w16cid:durableId="972632657">
     <w:abstractNumId w:val="6"/>
   </w:num>
-  <w:num w:numId="12">
+  <w:num w:numId="12" w16cid:durableId="936519689">
     <w:abstractNumId w:val="4"/>
   </w:num>
   <w:numIdMacAtCleanup w:val="2"/>
@@ -10930,7 +10984,7 @@
 </file>
 
 <file path=word/styles.xml><?xml version="1.0" encoding="utf-8"?>
-<w:styles xmlns:mc="http://schemas.openxmlformats.org/markup-compatibility/2006" xmlns:r="http://schemas.openxmlformats.org/officeDocument/2006/relationships" xmlns:w="http://schemas.openxmlformats.org/wordprocessingml/2006/main" xmlns:w14="http://schemas.microsoft.com/office/word/2010/wordml" xmlns:w15="http://schemas.microsoft.com/office/word/2012/wordml" xmlns:w16cex="http://schemas.microsoft.com/office/word/2018/wordml/cex" xmlns:w16cid="http://schemas.microsoft.com/office/word/2016/wordml/cid" xmlns:w16="http://schemas.microsoft.com/office/word/2018/wordml" xmlns:w16sdtdh="http://schemas.microsoft.com/office/word/2020/wordml/sdtdatahash" xmlns:w16se="http://schemas.microsoft.com/office/word/2015/wordml/symex" mc:Ignorable="w14 w15 w16se w16cid w16 w16cex w16sdtdh">
+<w:styles xmlns:mc="http://schemas.openxmlformats.org/markup-compatibility/2006" xmlns:r="http://schemas.openxmlformats.org/officeDocument/2006/relationships" xmlns:w="http://schemas.openxmlformats.org/wordprocessingml/2006/main" xmlns:w14="http://schemas.microsoft.com/office/word/2010/wordml" xmlns:w15="http://schemas.microsoft.com/office/word/2012/wordml" xmlns:w16cex="http://schemas.microsoft.com/office/word/2018/wordml/cex" xmlns:w16cid="http://schemas.microsoft.com/office/word/2016/wordml/cid" xmlns:w16="http://schemas.microsoft.com/office/word/2018/wordml" xmlns:w16du="http://schemas.microsoft.com/office/word/2023/wordml/word16du" xmlns:w16sdtdh="http://schemas.microsoft.com/office/word/2020/wordml/sdtdatahash" xmlns:w16sdtfl="http://schemas.microsoft.com/office/word/2024/wordml/sdtformatlock" xmlns:w16se="http://schemas.microsoft.com/office/word/2015/wordml/symex" mc:Ignorable="w14 w15 w16se w16cid w16 w16cex w16sdtdh w16sdtfl w16du">
   <w:docDefaults>
     <w:rPrDefault>
       <w:rPr>
@@ -11401,6 +11455,7 @@
   <w:style w:type="character" w:default="1" w:styleId="Fuentedeprrafopredeter">
     <w:name w:val="Default Paragraph Font"/>
     <w:uiPriority w:val="1"/>
+    <w:semiHidden/>
     <w:unhideWhenUsed/>
   </w:style>
   <w:style w:type="table" w:default="1" w:styleId="Tablanormal">

</xml_diff>

<commit_message>
Diccionario de datos - JobForUs
</commit_message>
<xml_diff>
--- a/FD01-EPIS-Informe de Factibilidad.docx
+++ b/FD01-EPIS-Informe de Factibilidad.docx
@@ -1,6 +1,6 @@
 
 <file path=word/document.xml><?xml version="1.0" encoding="utf-8"?>
-<w:document xmlns:wpc="http://schemas.microsoft.com/office/word/2010/wordprocessingCanvas" xmlns:cx="http://schemas.microsoft.com/office/drawing/2014/chartex" xmlns:cx1="http://schemas.microsoft.com/office/drawing/2015/9/8/chartex" xmlns:cx2="http://schemas.microsoft.com/office/drawing/2015/10/21/chartex" xmlns:cx3="http://schemas.microsoft.com/office/drawing/2016/5/9/chartex" xmlns:cx4="http://schemas.microsoft.com/office/drawing/2016/5/10/chartex" xmlns:cx5="http://schemas.microsoft.com/office/drawing/2016/5/11/chartex" xmlns:cx6="http://schemas.microsoft.com/office/drawing/2016/5/12/chartex" xmlns:cx7="http://schemas.microsoft.com/office/drawing/2016/5/13/chartex" xmlns:cx8="http://schemas.microsoft.com/office/drawing/2016/5/14/chartex" xmlns:mc="http://schemas.openxmlformats.org/markup-compatibility/2006" xmlns:aink="http://schemas.microsoft.com/office/drawing/2016/ink" xmlns:am3d="http://schemas.microsoft.com/office/drawing/2017/model3d" xmlns:o="urn:schemas-microsoft-com:office:office" xmlns:oel="http://schemas.microsoft.com/office/2019/extlst" xmlns:r="http://schemas.openxmlformats.org/officeDocument/2006/relationships" xmlns:m="http://schemas.openxmlformats.org/officeDocument/2006/math" xmlns:v="urn:schemas-microsoft-com:vml" xmlns:wp14="http://schemas.microsoft.com/office/word/2010/wordprocessingDrawing" xmlns:wp="http://schemas.openxmlformats.org/drawingml/2006/wordprocessingDrawing" xmlns:w10="urn:schemas-microsoft-com:office:word" xmlns:w="http://schemas.openxmlformats.org/wordprocessingml/2006/main" xmlns:w14="http://schemas.microsoft.com/office/word/2010/wordml" xmlns:w15="http://schemas.microsoft.com/office/word/2012/wordml" xmlns:w16cex="http://schemas.microsoft.com/office/word/2018/wordml/cex" xmlns:w16cid="http://schemas.microsoft.com/office/word/2016/wordml/cid" xmlns:w16="http://schemas.microsoft.com/office/word/2018/wordml" xmlns:w16du="http://schemas.microsoft.com/office/word/2023/wordml/word16du" xmlns:w16sdtdh="http://schemas.microsoft.com/office/word/2020/wordml/sdtdatahash" xmlns:w16sdtfl="http://schemas.microsoft.com/office/word/2024/wordml/sdtformatlock" xmlns:w16se="http://schemas.microsoft.com/office/word/2015/wordml/symex" xmlns:wpg="http://schemas.microsoft.com/office/word/2010/wordprocessingGroup" xmlns:wpi="http://schemas.microsoft.com/office/word/2010/wordprocessingInk" xmlns:wne="http://schemas.microsoft.com/office/word/2006/wordml" xmlns:wps="http://schemas.microsoft.com/office/word/2010/wordprocessingShape" mc:Ignorable="w14 w15 w16se w16cid w16 w16cex w16sdtdh w16sdtfl w16du wp14">
+<w:document xmlns:wpc="http://schemas.microsoft.com/office/word/2010/wordprocessingCanvas" xmlns:cx="http://schemas.microsoft.com/office/drawing/2014/chartex" xmlns:cx1="http://schemas.microsoft.com/office/drawing/2015/9/8/chartex" xmlns:cx2="http://schemas.microsoft.com/office/drawing/2015/10/21/chartex" xmlns:cx3="http://schemas.microsoft.com/office/drawing/2016/5/9/chartex" xmlns:cx4="http://schemas.microsoft.com/office/drawing/2016/5/10/chartex" xmlns:cx5="http://schemas.microsoft.com/office/drawing/2016/5/11/chartex" xmlns:cx6="http://schemas.microsoft.com/office/drawing/2016/5/12/chartex" xmlns:cx7="http://schemas.microsoft.com/office/drawing/2016/5/13/chartex" xmlns:cx8="http://schemas.microsoft.com/office/drawing/2016/5/14/chartex" xmlns:mc="http://schemas.openxmlformats.org/markup-compatibility/2006" xmlns:aink="http://schemas.microsoft.com/office/drawing/2016/ink" xmlns:am3d="http://schemas.microsoft.com/office/drawing/2017/model3d" xmlns:o="urn:schemas-microsoft-com:office:office" xmlns:r="http://schemas.openxmlformats.org/officeDocument/2006/relationships" xmlns:m="http://schemas.openxmlformats.org/officeDocument/2006/math" xmlns:v="urn:schemas-microsoft-com:vml" xmlns:wp14="http://schemas.microsoft.com/office/word/2010/wordprocessingDrawing" xmlns:wp="http://schemas.openxmlformats.org/drawingml/2006/wordprocessingDrawing" xmlns:w10="urn:schemas-microsoft-com:office:word" xmlns:w="http://schemas.openxmlformats.org/wordprocessingml/2006/main" xmlns:w14="http://schemas.microsoft.com/office/word/2010/wordml" xmlns:w15="http://schemas.microsoft.com/office/word/2012/wordml" xmlns:w16cex="http://schemas.microsoft.com/office/word/2018/wordml/cex" xmlns:w16cid="http://schemas.microsoft.com/office/word/2016/wordml/cid" xmlns:w16="http://schemas.microsoft.com/office/word/2018/wordml" xmlns:w16sdtdh="http://schemas.microsoft.com/office/word/2020/wordml/sdtdatahash" xmlns:w16se="http://schemas.microsoft.com/office/word/2015/wordml/symex" xmlns:wpg="http://schemas.microsoft.com/office/word/2010/wordprocessingGroup" xmlns:wpi="http://schemas.microsoft.com/office/word/2010/wordprocessingInk" xmlns:wne="http://schemas.microsoft.com/office/word/2006/wordml" xmlns:wps="http://schemas.microsoft.com/office/word/2010/wordprocessingShape" mc:Ignorable="w14 w15 w16se w16cid w16 w16cex w16sdtdh wp14">
   <w:body>
     <w:p>
       <w:pPr>
@@ -285,6 +285,7 @@
         </w:rPr>
         <w:t>“</w:t>
       </w:r>
+      <w:bookmarkStart w:id="0" w:name="_Hlk234278508"/>
       <w:proofErr w:type="spellStart"/>
       <w:r>
         <w:rPr>
@@ -331,7 +332,19 @@
           <w:sz w:val="36"/>
           <w:szCs w:val="36"/>
         </w:rPr>
-        <w:t xml:space="preserve"> para el Análisis del Mercado Laboral Tecnológico”</w:t>
+        <w:t xml:space="preserve"> para el Análisis del Mercado Laboral Tecnológico</w:t>
+      </w:r>
+      <w:bookmarkEnd w:id="0"/>
+      <w:r>
+        <w:rPr>
+          <w:rFonts w:ascii="Arial" w:hAnsi="Arial" w:cs="Arial"/>
+          <w:b/>
+          <w:iCs/>
+          <w:color w:val="000000"/>
+          <w:sz w:val="36"/>
+          <w:szCs w:val="36"/>
+        </w:rPr>
+        <w:t>”</w:t>
       </w:r>
     </w:p>
     <w:p>
@@ -469,18 +482,30 @@
           <w:szCs w:val="32"/>
           <w:lang w:eastAsia="es-PE"/>
         </w:rPr>
-        <w:t xml:space="preserve"> Mag. Patrick Quadros Quiroga</w:t>
-      </w:r>
+        <w:t xml:space="preserve"> </w:t>
+      </w:r>
+      <w:bookmarkStart w:id="1" w:name="_Hlk228273764"/>
+      <w:proofErr w:type="spellStart"/>
       <w:r>
         <w:rPr>
           <w:rFonts w:ascii="Arial" w:eastAsia="Times New Roman" w:hAnsi="Arial" w:cs="Arial"/>
-          <w:i/>
           <w:sz w:val="32"/>
           <w:szCs w:val="32"/>
           <w:lang w:eastAsia="es-PE"/>
         </w:rPr>
-        <w:t xml:space="preserve"> </w:t>
-      </w:r>
+        <w:t>Mag</w:t>
+      </w:r>
+      <w:proofErr w:type="spellEnd"/>
+      <w:r>
+        <w:rPr>
+          <w:rFonts w:ascii="Arial" w:eastAsia="Times New Roman" w:hAnsi="Arial" w:cs="Arial"/>
+          <w:sz w:val="32"/>
+          <w:szCs w:val="32"/>
+          <w:lang w:eastAsia="es-PE"/>
+        </w:rPr>
+        <w:t>. Patrick Cuadros Quiroga</w:t>
+      </w:r>
+      <w:bookmarkEnd w:id="1"/>
     </w:p>
     <w:p>
       <w:pPr>
@@ -555,7 +580,7 @@
         <w:rPr>
           <w:rFonts w:ascii="Arial" w:eastAsia="Times New Roman" w:hAnsi="Arial" w:cs="Arial"/>
           <w:b/>
-          <w:i/>
+          <w:iCs/>
           <w:sz w:val="28"/>
           <w:szCs w:val="28"/>
           <w:lang w:eastAsia="es-PE"/>
@@ -565,46 +590,60 @@
         <w:rPr>
           <w:rFonts w:ascii="Arial" w:eastAsia="Times New Roman" w:hAnsi="Arial" w:cs="Arial"/>
           <w:b/>
-          <w:i/>
+          <w:iCs/>
           <w:sz w:val="28"/>
           <w:szCs w:val="28"/>
           <w:lang w:eastAsia="es-PE"/>
         </w:rPr>
-        <w:t>Royser Alonsso Villanueva Mamani</w:t>
-      </w:r>
+        <w:t xml:space="preserve">Villanueva Mamani, </w:t>
+      </w:r>
+      <w:proofErr w:type="spellStart"/>
       <w:r>
         <w:rPr>
           <w:rFonts w:ascii="Arial" w:eastAsia="Times New Roman" w:hAnsi="Arial" w:cs="Arial"/>
           <w:b/>
-          <w:i/>
+          <w:iCs/>
           <w:sz w:val="28"/>
           <w:szCs w:val="28"/>
           <w:lang w:eastAsia="es-PE"/>
         </w:rPr>
-        <w:tab/>
-      </w:r>
+        <w:t>Royser</w:t>
+      </w:r>
+      <w:proofErr w:type="spellEnd"/>
       <w:r>
         <w:rPr>
           <w:rFonts w:ascii="Arial" w:eastAsia="Times New Roman" w:hAnsi="Arial" w:cs="Arial"/>
           <w:b/>
-          <w:i/>
+          <w:iCs/>
           <w:sz w:val="28"/>
           <w:szCs w:val="28"/>
           <w:lang w:eastAsia="es-PE"/>
         </w:rPr>
-        <w:tab/>
-      </w:r>
+        <w:t xml:space="preserve"> </w:t>
+      </w:r>
+      <w:proofErr w:type="spellStart"/>
       <w:r>
         <w:rPr>
           <w:rFonts w:ascii="Arial" w:eastAsia="Times New Roman" w:hAnsi="Arial" w:cs="Arial"/>
           <w:b/>
-          <w:i/>
+          <w:iCs/>
           <w:sz w:val="28"/>
           <w:szCs w:val="28"/>
           <w:lang w:eastAsia="es-PE"/>
         </w:rPr>
-        <w:tab/>
-        <w:t>(2021071090)</w:t>
+        <w:t>Alonsso</w:t>
+      </w:r>
+      <w:proofErr w:type="spellEnd"/>
+      <w:r>
+        <w:rPr>
+          <w:rFonts w:ascii="Arial" w:eastAsia="Times New Roman" w:hAnsi="Arial" w:cs="Arial"/>
+          <w:b/>
+          <w:iCs/>
+          <w:sz w:val="28"/>
+          <w:szCs w:val="28"/>
+          <w:lang w:eastAsia="es-PE"/>
+        </w:rPr>
+        <w:t xml:space="preserve"> (2021071090)</w:t>
       </w:r>
     </w:p>
     <w:p>
@@ -2832,11 +2871,11 @@
         <w:pStyle w:val="Ttulo1"/>
         <w:spacing w:before="0" w:after="240"/>
       </w:pPr>
-      <w:bookmarkStart w:id="0" w:name="_Toc52661346"/>
+      <w:bookmarkStart w:id="2" w:name="_Toc52661346"/>
       <w:r>
         <w:t>Descripción del Proyecto</w:t>
       </w:r>
-      <w:bookmarkEnd w:id="0"/>
+      <w:bookmarkEnd w:id="2"/>
     </w:p>
     <w:p>
       <w:pPr>
@@ -3276,11 +3315,11 @@
       <w:pPr>
         <w:pStyle w:val="Ttulo1"/>
       </w:pPr>
-      <w:bookmarkStart w:id="1" w:name="_Toc52661347"/>
+      <w:bookmarkStart w:id="3" w:name="_Toc52661347"/>
       <w:r>
         <w:t>Riesgos</w:t>
       </w:r>
-      <w:bookmarkEnd w:id="1"/>
+      <w:bookmarkEnd w:id="3"/>
     </w:p>
     <w:p>
       <w:pPr>
@@ -3645,7 +3684,7 @@
       <w:pPr>
         <w:pStyle w:val="Ttulo1"/>
       </w:pPr>
-      <w:bookmarkStart w:id="2" w:name="_Toc52661348"/>
+      <w:bookmarkStart w:id="4" w:name="_Toc52661348"/>
       <w:r>
         <w:t>Análisis</w:t>
       </w:r>
@@ -3658,7 +3697,7 @@
       <w:r>
         <w:t xml:space="preserve"> actual</w:t>
       </w:r>
-      <w:bookmarkEnd w:id="2"/>
+      <w:bookmarkEnd w:id="4"/>
     </w:p>
     <w:p>
       <w:pPr>
@@ -4184,25 +4223,25 @@
       <w:pPr>
         <w:pStyle w:val="Ttulo1"/>
       </w:pPr>
-      <w:bookmarkStart w:id="3" w:name="_Toc52661349"/>
+      <w:bookmarkStart w:id="5" w:name="_Toc52661349"/>
       <w:r>
         <w:t xml:space="preserve">Estudio de </w:t>
       </w:r>
       <w:r>
         <w:t>Factibilidad</w:t>
       </w:r>
-      <w:bookmarkEnd w:id="3"/>
+      <w:bookmarkEnd w:id="5"/>
     </w:p>
     <w:p>
       <w:pPr>
         <w:pStyle w:val="Ttulo2"/>
       </w:pPr>
-      <w:bookmarkStart w:id="4" w:name="_Toc52661350"/>
+      <w:bookmarkStart w:id="6" w:name="_Toc52661350"/>
       <w:r>
         <w:lastRenderedPageBreak/>
         <w:t>Factibilidad Técnica</w:t>
       </w:r>
-      <w:bookmarkEnd w:id="4"/>
+      <w:bookmarkEnd w:id="6"/>
     </w:p>
     <w:p>
       <w:pPr>
@@ -4506,7 +4545,7 @@
       <w:pPr>
         <w:pStyle w:val="Ttulo2"/>
       </w:pPr>
-      <w:bookmarkStart w:id="5" w:name="_Toc52661351"/>
+      <w:bookmarkStart w:id="7" w:name="_Toc52661351"/>
       <w:r>
         <w:t>F</w:t>
       </w:r>
@@ -4519,7 +4558,7 @@
       <w:r>
         <w:t>conómica</w:t>
       </w:r>
-      <w:bookmarkEnd w:id="5"/>
+      <w:bookmarkEnd w:id="7"/>
     </w:p>
     <w:p>
       <w:pPr>
@@ -6363,11 +6402,11 @@
       <w:pPr>
         <w:pStyle w:val="Ttulo2"/>
       </w:pPr>
-      <w:bookmarkStart w:id="6" w:name="_Toc52661352"/>
+      <w:bookmarkStart w:id="8" w:name="_Toc52661352"/>
       <w:r>
         <w:t>Factibilidad Operativa</w:t>
       </w:r>
-      <w:bookmarkEnd w:id="6"/>
+      <w:bookmarkEnd w:id="8"/>
     </w:p>
     <w:p>
       <w:pPr>
@@ -6620,11 +6659,11 @@
         <w:pStyle w:val="Ttulo2"/>
         <w:spacing w:line="276" w:lineRule="auto"/>
       </w:pPr>
-      <w:bookmarkStart w:id="7" w:name="_Toc52661353"/>
+      <w:bookmarkStart w:id="9" w:name="_Toc52661353"/>
       <w:r>
         <w:t>Factibilidad Legal</w:t>
       </w:r>
-      <w:bookmarkEnd w:id="7"/>
+      <w:bookmarkEnd w:id="9"/>
     </w:p>
     <w:p>
       <w:pPr>
@@ -6819,11 +6858,11 @@
         <w:pStyle w:val="Ttulo2"/>
         <w:spacing w:line="276" w:lineRule="auto"/>
       </w:pPr>
-      <w:bookmarkStart w:id="8" w:name="_Toc52661354"/>
+      <w:bookmarkStart w:id="10" w:name="_Toc52661354"/>
       <w:r>
         <w:t>Factibilidad Social</w:t>
       </w:r>
-      <w:bookmarkEnd w:id="8"/>
+      <w:bookmarkEnd w:id="10"/>
     </w:p>
     <w:p>
       <w:pPr>
@@ -6915,11 +6954,11 @@
       <w:pPr>
         <w:pStyle w:val="Ttulo2"/>
       </w:pPr>
-      <w:bookmarkStart w:id="9" w:name="_Toc52661355"/>
+      <w:bookmarkStart w:id="11" w:name="_Toc52661355"/>
       <w:r>
         <w:t>Factibilidad Ambiental</w:t>
       </w:r>
-      <w:bookmarkEnd w:id="9"/>
+      <w:bookmarkEnd w:id="11"/>
     </w:p>
     <w:p>
       <w:pPr>
@@ -7056,14 +7095,14 @@
       <w:pPr>
         <w:pStyle w:val="Ttulo1"/>
       </w:pPr>
-      <w:bookmarkStart w:id="10" w:name="_Toc52661356"/>
+      <w:bookmarkStart w:id="12" w:name="_Toc52661356"/>
       <w:r>
         <w:t>Análisis</w:t>
       </w:r>
       <w:r>
         <w:t xml:space="preserve"> Financiero</w:t>
       </w:r>
-      <w:bookmarkEnd w:id="10"/>
+      <w:bookmarkEnd w:id="12"/>
     </w:p>
     <w:p>
       <w:pPr>
@@ -8766,11 +8805,11 @@
       <w:pPr>
         <w:pStyle w:val="Ttulo1"/>
       </w:pPr>
-      <w:bookmarkStart w:id="11" w:name="_Toc52661357"/>
+      <w:bookmarkStart w:id="13" w:name="_Toc52661357"/>
       <w:r>
         <w:t>Conclusiones</w:t>
       </w:r>
-      <w:bookmarkEnd w:id="11"/>
+      <w:bookmarkEnd w:id="13"/>
     </w:p>
     <w:p>
       <w:pPr>
@@ -9475,7 +9514,7 @@
 </file>
 
 <file path=word/endnotes.xml><?xml version="1.0" encoding="utf-8"?>
-<w:endnotes xmlns:wpc="http://schemas.microsoft.com/office/word/2010/wordprocessingCanvas" xmlns:cx="http://schemas.microsoft.com/office/drawing/2014/chartex" xmlns:cx1="http://schemas.microsoft.com/office/drawing/2015/9/8/chartex" xmlns:cx2="http://schemas.microsoft.com/office/drawing/2015/10/21/chartex" xmlns:cx3="http://schemas.microsoft.com/office/drawing/2016/5/9/chartex" xmlns:cx4="http://schemas.microsoft.com/office/drawing/2016/5/10/chartex" xmlns:cx5="http://schemas.microsoft.com/office/drawing/2016/5/11/chartex" xmlns:cx6="http://schemas.microsoft.com/office/drawing/2016/5/12/chartex" xmlns:cx7="http://schemas.microsoft.com/office/drawing/2016/5/13/chartex" xmlns:cx8="http://schemas.microsoft.com/office/drawing/2016/5/14/chartex" xmlns:mc="http://schemas.openxmlformats.org/markup-compatibility/2006" xmlns:aink="http://schemas.microsoft.com/office/drawing/2016/ink" xmlns:am3d="http://schemas.microsoft.com/office/drawing/2017/model3d" xmlns:o="urn:schemas-microsoft-com:office:office" xmlns:oel="http://schemas.microsoft.com/office/2019/extlst" xmlns:r="http://schemas.openxmlformats.org/officeDocument/2006/relationships" xmlns:m="http://schemas.openxmlformats.org/officeDocument/2006/math" xmlns:v="urn:schemas-microsoft-com:vml" xmlns:wp14="http://schemas.microsoft.com/office/word/2010/wordprocessingDrawing" xmlns:wp="http://schemas.openxmlformats.org/drawingml/2006/wordprocessingDrawing" xmlns:w10="urn:schemas-microsoft-com:office:word" xmlns:w="http://schemas.openxmlformats.org/wordprocessingml/2006/main" xmlns:w14="http://schemas.microsoft.com/office/word/2010/wordml" xmlns:w15="http://schemas.microsoft.com/office/word/2012/wordml" xmlns:w16cex="http://schemas.microsoft.com/office/word/2018/wordml/cex" xmlns:w16cid="http://schemas.microsoft.com/office/word/2016/wordml/cid" xmlns:w16="http://schemas.microsoft.com/office/word/2018/wordml" xmlns:w16du="http://schemas.microsoft.com/office/word/2023/wordml/word16du" xmlns:w16sdtdh="http://schemas.microsoft.com/office/word/2020/wordml/sdtdatahash" xmlns:w16sdtfl="http://schemas.microsoft.com/office/word/2024/wordml/sdtformatlock" xmlns:w16se="http://schemas.microsoft.com/office/word/2015/wordml/symex" xmlns:wpg="http://schemas.microsoft.com/office/word/2010/wordprocessingGroup" xmlns:wpi="http://schemas.microsoft.com/office/word/2010/wordprocessingInk" xmlns:wne="http://schemas.microsoft.com/office/word/2006/wordml" xmlns:wps="http://schemas.microsoft.com/office/word/2010/wordprocessingShape" mc:Ignorable="w14 w15 w16se w16cid w16 w16cex w16sdtdh w16sdtfl w16du wp14">
+<w:endnotes xmlns:wpc="http://schemas.microsoft.com/office/word/2010/wordprocessingCanvas" xmlns:cx="http://schemas.microsoft.com/office/drawing/2014/chartex" xmlns:cx1="http://schemas.microsoft.com/office/drawing/2015/9/8/chartex" xmlns:cx2="http://schemas.microsoft.com/office/drawing/2015/10/21/chartex" xmlns:cx3="http://schemas.microsoft.com/office/drawing/2016/5/9/chartex" xmlns:cx4="http://schemas.microsoft.com/office/drawing/2016/5/10/chartex" xmlns:cx5="http://schemas.microsoft.com/office/drawing/2016/5/11/chartex" xmlns:cx6="http://schemas.microsoft.com/office/drawing/2016/5/12/chartex" xmlns:cx7="http://schemas.microsoft.com/office/drawing/2016/5/13/chartex" xmlns:cx8="http://schemas.microsoft.com/office/drawing/2016/5/14/chartex" xmlns:mc="http://schemas.openxmlformats.org/markup-compatibility/2006" xmlns:aink="http://schemas.microsoft.com/office/drawing/2016/ink" xmlns:am3d="http://schemas.microsoft.com/office/drawing/2017/model3d" xmlns:o="urn:schemas-microsoft-com:office:office" xmlns:r="http://schemas.openxmlformats.org/officeDocument/2006/relationships" xmlns:m="http://schemas.openxmlformats.org/officeDocument/2006/math" xmlns:v="urn:schemas-microsoft-com:vml" xmlns:wp14="http://schemas.microsoft.com/office/word/2010/wordprocessingDrawing" xmlns:wp="http://schemas.openxmlformats.org/drawingml/2006/wordprocessingDrawing" xmlns:w10="urn:schemas-microsoft-com:office:word" xmlns:w="http://schemas.openxmlformats.org/wordprocessingml/2006/main" xmlns:w14="http://schemas.microsoft.com/office/word/2010/wordml" xmlns:w15="http://schemas.microsoft.com/office/word/2012/wordml" xmlns:w16cex="http://schemas.microsoft.com/office/word/2018/wordml/cex" xmlns:w16cid="http://schemas.microsoft.com/office/word/2016/wordml/cid" xmlns:w16="http://schemas.microsoft.com/office/word/2018/wordml" xmlns:w16sdtdh="http://schemas.microsoft.com/office/word/2020/wordml/sdtdatahash" xmlns:w16se="http://schemas.microsoft.com/office/word/2015/wordml/symex" xmlns:wpg="http://schemas.microsoft.com/office/word/2010/wordprocessingGroup" xmlns:wpi="http://schemas.microsoft.com/office/word/2010/wordprocessingInk" xmlns:wne="http://schemas.microsoft.com/office/word/2006/wordml" xmlns:wps="http://schemas.microsoft.com/office/word/2010/wordprocessingShape" mc:Ignorable="w14 w15 w16se w16cid w16 w16cex w16sdtdh wp14">
   <w:endnote w:type="separator" w:id="-1">
     <w:p>
       <w:pPr>
@@ -9500,7 +9539,7 @@
 </file>
 
 <file path=word/footer1.xml><?xml version="1.0" encoding="utf-8"?>
-<w:ftr xmlns:wpc="http://schemas.microsoft.com/office/word/2010/wordprocessingCanvas" xmlns:cx="http://schemas.microsoft.com/office/drawing/2014/chartex" xmlns:cx1="http://schemas.microsoft.com/office/drawing/2015/9/8/chartex" xmlns:cx2="http://schemas.microsoft.com/office/drawing/2015/10/21/chartex" xmlns:cx3="http://schemas.microsoft.com/office/drawing/2016/5/9/chartex" xmlns:cx4="http://schemas.microsoft.com/office/drawing/2016/5/10/chartex" xmlns:cx5="http://schemas.microsoft.com/office/drawing/2016/5/11/chartex" xmlns:cx6="http://schemas.microsoft.com/office/drawing/2016/5/12/chartex" xmlns:cx7="http://schemas.microsoft.com/office/drawing/2016/5/13/chartex" xmlns:cx8="http://schemas.microsoft.com/office/drawing/2016/5/14/chartex" xmlns:mc="http://schemas.openxmlformats.org/markup-compatibility/2006" xmlns:aink="http://schemas.microsoft.com/office/drawing/2016/ink" xmlns:am3d="http://schemas.microsoft.com/office/drawing/2017/model3d" xmlns:o="urn:schemas-microsoft-com:office:office" xmlns:oel="http://schemas.microsoft.com/office/2019/extlst" xmlns:r="http://schemas.openxmlformats.org/officeDocument/2006/relationships" xmlns:m="http://schemas.openxmlformats.org/officeDocument/2006/math" xmlns:v="urn:schemas-microsoft-com:vml" xmlns:wp14="http://schemas.microsoft.com/office/word/2010/wordprocessingDrawing" xmlns:wp="http://schemas.openxmlformats.org/drawingml/2006/wordprocessingDrawing" xmlns:w10="urn:schemas-microsoft-com:office:word" xmlns:w="http://schemas.openxmlformats.org/wordprocessingml/2006/main" xmlns:w14="http://schemas.microsoft.com/office/word/2010/wordml" xmlns:w15="http://schemas.microsoft.com/office/word/2012/wordml" xmlns:w16cex="http://schemas.microsoft.com/office/word/2018/wordml/cex" xmlns:w16cid="http://schemas.microsoft.com/office/word/2016/wordml/cid" xmlns:w16="http://schemas.microsoft.com/office/word/2018/wordml" xmlns:w16du="http://schemas.microsoft.com/office/word/2023/wordml/word16du" xmlns:w16sdtdh="http://schemas.microsoft.com/office/word/2020/wordml/sdtdatahash" xmlns:w16sdtfl="http://schemas.microsoft.com/office/word/2024/wordml/sdtformatlock" xmlns:w16se="http://schemas.microsoft.com/office/word/2015/wordml/symex" xmlns:wpg="http://schemas.microsoft.com/office/word/2010/wordprocessingGroup" xmlns:wpi="http://schemas.microsoft.com/office/word/2010/wordprocessingInk" xmlns:wne="http://schemas.microsoft.com/office/word/2006/wordml" xmlns:wps="http://schemas.microsoft.com/office/word/2010/wordprocessingShape" mc:Ignorable="w14 w15 w16se w16cid w16 w16cex w16sdtdh w16sdtfl w16du wp14">
+<w:ftr xmlns:wpc="http://schemas.microsoft.com/office/word/2010/wordprocessingCanvas" xmlns:cx="http://schemas.microsoft.com/office/drawing/2014/chartex" xmlns:cx1="http://schemas.microsoft.com/office/drawing/2015/9/8/chartex" xmlns:cx2="http://schemas.microsoft.com/office/drawing/2015/10/21/chartex" xmlns:cx3="http://schemas.microsoft.com/office/drawing/2016/5/9/chartex" xmlns:cx4="http://schemas.microsoft.com/office/drawing/2016/5/10/chartex" xmlns:cx5="http://schemas.microsoft.com/office/drawing/2016/5/11/chartex" xmlns:cx6="http://schemas.microsoft.com/office/drawing/2016/5/12/chartex" xmlns:cx7="http://schemas.microsoft.com/office/drawing/2016/5/13/chartex" xmlns:cx8="http://schemas.microsoft.com/office/drawing/2016/5/14/chartex" xmlns:mc="http://schemas.openxmlformats.org/markup-compatibility/2006" xmlns:aink="http://schemas.microsoft.com/office/drawing/2016/ink" xmlns:am3d="http://schemas.microsoft.com/office/drawing/2017/model3d" xmlns:o="urn:schemas-microsoft-com:office:office" xmlns:r="http://schemas.openxmlformats.org/officeDocument/2006/relationships" xmlns:m="http://schemas.openxmlformats.org/officeDocument/2006/math" xmlns:v="urn:schemas-microsoft-com:vml" xmlns:wp14="http://schemas.microsoft.com/office/word/2010/wordprocessingDrawing" xmlns:wp="http://schemas.openxmlformats.org/drawingml/2006/wordprocessingDrawing" xmlns:w10="urn:schemas-microsoft-com:office:word" xmlns:w="http://schemas.openxmlformats.org/wordprocessingml/2006/main" xmlns:w14="http://schemas.microsoft.com/office/word/2010/wordml" xmlns:w15="http://schemas.microsoft.com/office/word/2012/wordml" xmlns:w16cex="http://schemas.microsoft.com/office/word/2018/wordml/cex" xmlns:w16cid="http://schemas.microsoft.com/office/word/2016/wordml/cid" xmlns:w16="http://schemas.microsoft.com/office/word/2018/wordml" xmlns:w16sdtdh="http://schemas.microsoft.com/office/word/2020/wordml/sdtdatahash" xmlns:w16se="http://schemas.microsoft.com/office/word/2015/wordml/symex" xmlns:wpg="http://schemas.microsoft.com/office/word/2010/wordprocessingGroup" xmlns:wpi="http://schemas.microsoft.com/office/word/2010/wordprocessingInk" xmlns:wne="http://schemas.microsoft.com/office/word/2006/wordml" xmlns:wps="http://schemas.microsoft.com/office/word/2010/wordprocessingShape" mc:Ignorable="w14 w15 w16se w16cid w16 w16cex w16sdtdh wp14">
   <w:sdt>
     <w:sdtPr>
       <w:id w:val="-1014383162"/>
@@ -9509,6 +9548,7 @@
         <w:docPartUnique/>
       </w:docPartObj>
     </w:sdtPr>
+    <w:sdtEndPr/>
     <w:sdtContent>
       <w:p>
         <w:pPr>
@@ -9546,7 +9586,7 @@
 </file>
 
 <file path=word/footnotes.xml><?xml version="1.0" encoding="utf-8"?>
-<w:footnotes xmlns:wpc="http://schemas.microsoft.com/office/word/2010/wordprocessingCanvas" xmlns:cx="http://schemas.microsoft.com/office/drawing/2014/chartex" xmlns:cx1="http://schemas.microsoft.com/office/drawing/2015/9/8/chartex" xmlns:cx2="http://schemas.microsoft.com/office/drawing/2015/10/21/chartex" xmlns:cx3="http://schemas.microsoft.com/office/drawing/2016/5/9/chartex" xmlns:cx4="http://schemas.microsoft.com/office/drawing/2016/5/10/chartex" xmlns:cx5="http://schemas.microsoft.com/office/drawing/2016/5/11/chartex" xmlns:cx6="http://schemas.microsoft.com/office/drawing/2016/5/12/chartex" xmlns:cx7="http://schemas.microsoft.com/office/drawing/2016/5/13/chartex" xmlns:cx8="http://schemas.microsoft.com/office/drawing/2016/5/14/chartex" xmlns:mc="http://schemas.openxmlformats.org/markup-compatibility/2006" xmlns:aink="http://schemas.microsoft.com/office/drawing/2016/ink" xmlns:am3d="http://schemas.microsoft.com/office/drawing/2017/model3d" xmlns:o="urn:schemas-microsoft-com:office:office" xmlns:oel="http://schemas.microsoft.com/office/2019/extlst" xmlns:r="http://schemas.openxmlformats.org/officeDocument/2006/relationships" xmlns:m="http://schemas.openxmlformats.org/officeDocument/2006/math" xmlns:v="urn:schemas-microsoft-com:vml" xmlns:wp14="http://schemas.microsoft.com/office/word/2010/wordprocessingDrawing" xmlns:wp="http://schemas.openxmlformats.org/drawingml/2006/wordprocessingDrawing" xmlns:w10="urn:schemas-microsoft-com:office:word" xmlns:w="http://schemas.openxmlformats.org/wordprocessingml/2006/main" xmlns:w14="http://schemas.microsoft.com/office/word/2010/wordml" xmlns:w15="http://schemas.microsoft.com/office/word/2012/wordml" xmlns:w16cex="http://schemas.microsoft.com/office/word/2018/wordml/cex" xmlns:w16cid="http://schemas.microsoft.com/office/word/2016/wordml/cid" xmlns:w16="http://schemas.microsoft.com/office/word/2018/wordml" xmlns:w16du="http://schemas.microsoft.com/office/word/2023/wordml/word16du" xmlns:w16sdtdh="http://schemas.microsoft.com/office/word/2020/wordml/sdtdatahash" xmlns:w16sdtfl="http://schemas.microsoft.com/office/word/2024/wordml/sdtformatlock" xmlns:w16se="http://schemas.microsoft.com/office/word/2015/wordml/symex" xmlns:wpg="http://schemas.microsoft.com/office/word/2010/wordprocessingGroup" xmlns:wpi="http://schemas.microsoft.com/office/word/2010/wordprocessingInk" xmlns:wne="http://schemas.microsoft.com/office/word/2006/wordml" xmlns:wps="http://schemas.microsoft.com/office/word/2010/wordprocessingShape" mc:Ignorable="w14 w15 w16se w16cid w16 w16cex w16sdtdh w16sdtfl w16du wp14">
+<w:footnotes xmlns:wpc="http://schemas.microsoft.com/office/word/2010/wordprocessingCanvas" xmlns:cx="http://schemas.microsoft.com/office/drawing/2014/chartex" xmlns:cx1="http://schemas.microsoft.com/office/drawing/2015/9/8/chartex" xmlns:cx2="http://schemas.microsoft.com/office/drawing/2015/10/21/chartex" xmlns:cx3="http://schemas.microsoft.com/office/drawing/2016/5/9/chartex" xmlns:cx4="http://schemas.microsoft.com/office/drawing/2016/5/10/chartex" xmlns:cx5="http://schemas.microsoft.com/office/drawing/2016/5/11/chartex" xmlns:cx6="http://schemas.microsoft.com/office/drawing/2016/5/12/chartex" xmlns:cx7="http://schemas.microsoft.com/office/drawing/2016/5/13/chartex" xmlns:cx8="http://schemas.microsoft.com/office/drawing/2016/5/14/chartex" xmlns:mc="http://schemas.openxmlformats.org/markup-compatibility/2006" xmlns:aink="http://schemas.microsoft.com/office/drawing/2016/ink" xmlns:am3d="http://schemas.microsoft.com/office/drawing/2017/model3d" xmlns:o="urn:schemas-microsoft-com:office:office" xmlns:r="http://schemas.openxmlformats.org/officeDocument/2006/relationships" xmlns:m="http://schemas.openxmlformats.org/officeDocument/2006/math" xmlns:v="urn:schemas-microsoft-com:vml" xmlns:wp14="http://schemas.microsoft.com/office/word/2010/wordprocessingDrawing" xmlns:wp="http://schemas.openxmlformats.org/drawingml/2006/wordprocessingDrawing" xmlns:w10="urn:schemas-microsoft-com:office:word" xmlns:w="http://schemas.openxmlformats.org/wordprocessingml/2006/main" xmlns:w14="http://schemas.microsoft.com/office/word/2010/wordml" xmlns:w15="http://schemas.microsoft.com/office/word/2012/wordml" xmlns:w16cex="http://schemas.microsoft.com/office/word/2018/wordml/cex" xmlns:w16cid="http://schemas.microsoft.com/office/word/2016/wordml/cid" xmlns:w16="http://schemas.microsoft.com/office/word/2018/wordml" xmlns:w16sdtdh="http://schemas.microsoft.com/office/word/2020/wordml/sdtdatahash" xmlns:w16se="http://schemas.microsoft.com/office/word/2015/wordml/symex" xmlns:wpg="http://schemas.microsoft.com/office/word/2010/wordprocessingGroup" xmlns:wpi="http://schemas.microsoft.com/office/word/2010/wordprocessingInk" xmlns:wne="http://schemas.microsoft.com/office/word/2006/wordml" xmlns:wps="http://schemas.microsoft.com/office/word/2010/wordprocessingShape" mc:Ignorable="w14 w15 w16se w16cid w16 w16cex w16sdtdh wp14">
   <w:footnote w:type="separator" w:id="-1">
     <w:p>
       <w:pPr>
@@ -9571,7 +9611,7 @@
 </file>
 
 <file path=word/header1.xml><?xml version="1.0" encoding="utf-8"?>
-<w:hdr xmlns:wpc="http://schemas.microsoft.com/office/word/2010/wordprocessingCanvas" xmlns:cx="http://schemas.microsoft.com/office/drawing/2014/chartex" xmlns:cx1="http://schemas.microsoft.com/office/drawing/2015/9/8/chartex" xmlns:cx2="http://schemas.microsoft.com/office/drawing/2015/10/21/chartex" xmlns:cx3="http://schemas.microsoft.com/office/drawing/2016/5/9/chartex" xmlns:cx4="http://schemas.microsoft.com/office/drawing/2016/5/10/chartex" xmlns:cx5="http://schemas.microsoft.com/office/drawing/2016/5/11/chartex" xmlns:cx6="http://schemas.microsoft.com/office/drawing/2016/5/12/chartex" xmlns:cx7="http://schemas.microsoft.com/office/drawing/2016/5/13/chartex" xmlns:cx8="http://schemas.microsoft.com/office/drawing/2016/5/14/chartex" xmlns:mc="http://schemas.openxmlformats.org/markup-compatibility/2006" xmlns:aink="http://schemas.microsoft.com/office/drawing/2016/ink" xmlns:am3d="http://schemas.microsoft.com/office/drawing/2017/model3d" xmlns:o="urn:schemas-microsoft-com:office:office" xmlns:oel="http://schemas.microsoft.com/office/2019/extlst" xmlns:r="http://schemas.openxmlformats.org/officeDocument/2006/relationships" xmlns:m="http://schemas.openxmlformats.org/officeDocument/2006/math" xmlns:v="urn:schemas-microsoft-com:vml" xmlns:wp14="http://schemas.microsoft.com/office/word/2010/wordprocessingDrawing" xmlns:wp="http://schemas.openxmlformats.org/drawingml/2006/wordprocessingDrawing" xmlns:w10="urn:schemas-microsoft-com:office:word" xmlns:w="http://schemas.openxmlformats.org/wordprocessingml/2006/main" xmlns:w14="http://schemas.microsoft.com/office/word/2010/wordml" xmlns:w15="http://schemas.microsoft.com/office/word/2012/wordml" xmlns:w16cex="http://schemas.microsoft.com/office/word/2018/wordml/cex" xmlns:w16cid="http://schemas.microsoft.com/office/word/2016/wordml/cid" xmlns:w16="http://schemas.microsoft.com/office/word/2018/wordml" xmlns:w16du="http://schemas.microsoft.com/office/word/2023/wordml/word16du" xmlns:w16sdtdh="http://schemas.microsoft.com/office/word/2020/wordml/sdtdatahash" xmlns:w16sdtfl="http://schemas.microsoft.com/office/word/2024/wordml/sdtformatlock" xmlns:w16se="http://schemas.microsoft.com/office/word/2015/wordml/symex" xmlns:wpg="http://schemas.microsoft.com/office/word/2010/wordprocessingGroup" xmlns:wpi="http://schemas.microsoft.com/office/word/2010/wordprocessingInk" xmlns:wne="http://schemas.microsoft.com/office/word/2006/wordml" xmlns:wps="http://schemas.microsoft.com/office/word/2010/wordprocessingShape" mc:Ignorable="w14 w15 w16se w16cid w16 w16cex w16sdtdh w16sdtfl w16du wp14">
+<w:hdr xmlns:wpc="http://schemas.microsoft.com/office/word/2010/wordprocessingCanvas" xmlns:cx="http://schemas.microsoft.com/office/drawing/2014/chartex" xmlns:cx1="http://schemas.microsoft.com/office/drawing/2015/9/8/chartex" xmlns:cx2="http://schemas.microsoft.com/office/drawing/2015/10/21/chartex" xmlns:cx3="http://schemas.microsoft.com/office/drawing/2016/5/9/chartex" xmlns:cx4="http://schemas.microsoft.com/office/drawing/2016/5/10/chartex" xmlns:cx5="http://schemas.microsoft.com/office/drawing/2016/5/11/chartex" xmlns:cx6="http://schemas.microsoft.com/office/drawing/2016/5/12/chartex" xmlns:cx7="http://schemas.microsoft.com/office/drawing/2016/5/13/chartex" xmlns:cx8="http://schemas.microsoft.com/office/drawing/2016/5/14/chartex" xmlns:mc="http://schemas.openxmlformats.org/markup-compatibility/2006" xmlns:aink="http://schemas.microsoft.com/office/drawing/2016/ink" xmlns:am3d="http://schemas.microsoft.com/office/drawing/2017/model3d" xmlns:o="urn:schemas-microsoft-com:office:office" xmlns:r="http://schemas.openxmlformats.org/officeDocument/2006/relationships" xmlns:m="http://schemas.openxmlformats.org/officeDocument/2006/math" xmlns:v="urn:schemas-microsoft-com:vml" xmlns:wp14="http://schemas.microsoft.com/office/word/2010/wordprocessingDrawing" xmlns:wp="http://schemas.openxmlformats.org/drawingml/2006/wordprocessingDrawing" xmlns:w10="urn:schemas-microsoft-com:office:word" xmlns:w="http://schemas.openxmlformats.org/wordprocessingml/2006/main" xmlns:w14="http://schemas.microsoft.com/office/word/2010/wordml" xmlns:w15="http://schemas.microsoft.com/office/word/2012/wordml" xmlns:w16cex="http://schemas.microsoft.com/office/word/2018/wordml/cex" xmlns:w16cid="http://schemas.microsoft.com/office/word/2016/wordml/cid" xmlns:w16="http://schemas.microsoft.com/office/word/2018/wordml" xmlns:w16sdtdh="http://schemas.microsoft.com/office/word/2020/wordml/sdtdatahash" xmlns:w16se="http://schemas.microsoft.com/office/word/2015/wordml/symex" xmlns:wpg="http://schemas.microsoft.com/office/word/2010/wordprocessingGroup" xmlns:wpi="http://schemas.microsoft.com/office/word/2010/wordprocessingInk" xmlns:wne="http://schemas.microsoft.com/office/word/2006/wordml" xmlns:wps="http://schemas.microsoft.com/office/word/2010/wordprocessingShape" mc:Ignorable="w14 w15 w16se w16cid w16 w16cex w16sdtdh wp14">
   <w:p>
     <w:pPr>
       <w:pStyle w:val="Encabezado"/>
@@ -9587,7 +9627,7 @@
 </file>
 
 <file path=word/numbering.xml><?xml version="1.0" encoding="utf-8"?>
-<w:numbering xmlns:wpc="http://schemas.microsoft.com/office/word/2010/wordprocessingCanvas" xmlns:cx="http://schemas.microsoft.com/office/drawing/2014/chartex" xmlns:cx1="http://schemas.microsoft.com/office/drawing/2015/9/8/chartex" xmlns:cx2="http://schemas.microsoft.com/office/drawing/2015/10/21/chartex" xmlns:cx3="http://schemas.microsoft.com/office/drawing/2016/5/9/chartex" xmlns:cx4="http://schemas.microsoft.com/office/drawing/2016/5/10/chartex" xmlns:cx5="http://schemas.microsoft.com/office/drawing/2016/5/11/chartex" xmlns:cx6="http://schemas.microsoft.com/office/drawing/2016/5/12/chartex" xmlns:cx7="http://schemas.microsoft.com/office/drawing/2016/5/13/chartex" xmlns:cx8="http://schemas.microsoft.com/office/drawing/2016/5/14/chartex" xmlns:mc="http://schemas.openxmlformats.org/markup-compatibility/2006" xmlns:aink="http://schemas.microsoft.com/office/drawing/2016/ink" xmlns:am3d="http://schemas.microsoft.com/office/drawing/2017/model3d" xmlns:o="urn:schemas-microsoft-com:office:office" xmlns:oel="http://schemas.microsoft.com/office/2019/extlst" xmlns:r="http://schemas.openxmlformats.org/officeDocument/2006/relationships" xmlns:m="http://schemas.openxmlformats.org/officeDocument/2006/math" xmlns:v="urn:schemas-microsoft-com:vml" xmlns:wp14="http://schemas.microsoft.com/office/word/2010/wordprocessingDrawing" xmlns:wp="http://schemas.openxmlformats.org/drawingml/2006/wordprocessingDrawing" xmlns:w10="urn:schemas-microsoft-com:office:word" xmlns:w="http://schemas.openxmlformats.org/wordprocessingml/2006/main" xmlns:w14="http://schemas.microsoft.com/office/word/2010/wordml" xmlns:w15="http://schemas.microsoft.com/office/word/2012/wordml" xmlns:w16cex="http://schemas.microsoft.com/office/word/2018/wordml/cex" xmlns:w16cid="http://schemas.microsoft.com/office/word/2016/wordml/cid" xmlns:w16="http://schemas.microsoft.com/office/word/2018/wordml" xmlns:w16du="http://schemas.microsoft.com/office/word/2023/wordml/word16du" xmlns:w16sdtdh="http://schemas.microsoft.com/office/word/2020/wordml/sdtdatahash" xmlns:w16sdtfl="http://schemas.microsoft.com/office/word/2024/wordml/sdtformatlock" xmlns:w16se="http://schemas.microsoft.com/office/word/2015/wordml/symex" xmlns:wpg="http://schemas.microsoft.com/office/word/2010/wordprocessingGroup" xmlns:wpi="http://schemas.microsoft.com/office/word/2010/wordprocessingInk" xmlns:wne="http://schemas.microsoft.com/office/word/2006/wordml" xmlns:wps="http://schemas.microsoft.com/office/word/2010/wordprocessingShape" mc:Ignorable="w14 w15 w16se w16cid w16 w16cex w16sdtdh w16sdtfl w16du wp14">
+<w:numbering xmlns:wpc="http://schemas.microsoft.com/office/word/2010/wordprocessingCanvas" xmlns:cx="http://schemas.microsoft.com/office/drawing/2014/chartex" xmlns:cx1="http://schemas.microsoft.com/office/drawing/2015/9/8/chartex" xmlns:cx2="http://schemas.microsoft.com/office/drawing/2015/10/21/chartex" xmlns:cx3="http://schemas.microsoft.com/office/drawing/2016/5/9/chartex" xmlns:cx4="http://schemas.microsoft.com/office/drawing/2016/5/10/chartex" xmlns:cx5="http://schemas.microsoft.com/office/drawing/2016/5/11/chartex" xmlns:cx6="http://schemas.microsoft.com/office/drawing/2016/5/12/chartex" xmlns:cx7="http://schemas.microsoft.com/office/drawing/2016/5/13/chartex" xmlns:cx8="http://schemas.microsoft.com/office/drawing/2016/5/14/chartex" xmlns:mc="http://schemas.openxmlformats.org/markup-compatibility/2006" xmlns:aink="http://schemas.microsoft.com/office/drawing/2016/ink" xmlns:am3d="http://schemas.microsoft.com/office/drawing/2017/model3d" xmlns:o="urn:schemas-microsoft-com:office:office" xmlns:r="http://schemas.openxmlformats.org/officeDocument/2006/relationships" xmlns:m="http://schemas.openxmlformats.org/officeDocument/2006/math" xmlns:v="urn:schemas-microsoft-com:vml" xmlns:wp14="http://schemas.microsoft.com/office/word/2010/wordprocessingDrawing" xmlns:wp="http://schemas.openxmlformats.org/drawingml/2006/wordprocessingDrawing" xmlns:w10="urn:schemas-microsoft-com:office:word" xmlns:w="http://schemas.openxmlformats.org/wordprocessingml/2006/main" xmlns:w14="http://schemas.microsoft.com/office/word/2010/wordml" xmlns:w15="http://schemas.microsoft.com/office/word/2012/wordml" xmlns:w16cex="http://schemas.microsoft.com/office/word/2018/wordml/cex" xmlns:w16cid="http://schemas.microsoft.com/office/word/2016/wordml/cid" xmlns:w16="http://schemas.microsoft.com/office/word/2018/wordml" xmlns:w16sdtdh="http://schemas.microsoft.com/office/word/2020/wordml/sdtdatahash" xmlns:w16se="http://schemas.microsoft.com/office/word/2015/wordml/symex" xmlns:wpg="http://schemas.microsoft.com/office/word/2010/wordprocessingGroup" xmlns:wpi="http://schemas.microsoft.com/office/word/2010/wordprocessingInk" xmlns:wne="http://schemas.microsoft.com/office/word/2006/wordml" xmlns:wps="http://schemas.microsoft.com/office/word/2010/wordprocessingShape" mc:Ignorable="w14 w15 w16se w16cid w16 w16cex w16sdtdh wp14">
   <w:abstractNum w:abstractNumId="0" w15:restartNumberingAfterBreak="0">
     <w:nsid w:val="05E3729F"/>
     <w:multiLevelType w:val="hybridMultilevel"/>
@@ -10943,40 +10983,40 @@
       </w:rPr>
     </w:lvl>
   </w:abstractNum>
-  <w:num w:numId="1" w16cid:durableId="1662387892">
+  <w:num w:numId="1">
     <w:abstractNumId w:val="5"/>
   </w:num>
-  <w:num w:numId="2" w16cid:durableId="490296113">
+  <w:num w:numId="2">
     <w:abstractNumId w:val="10"/>
   </w:num>
-  <w:num w:numId="3" w16cid:durableId="1100494525">
+  <w:num w:numId="3">
     <w:abstractNumId w:val="7"/>
   </w:num>
-  <w:num w:numId="4" w16cid:durableId="849025110">
+  <w:num w:numId="4">
     <w:abstractNumId w:val="9"/>
   </w:num>
-  <w:num w:numId="5" w16cid:durableId="946811934">
+  <w:num w:numId="5">
     <w:abstractNumId w:val="0"/>
   </w:num>
-  <w:num w:numId="6" w16cid:durableId="2021658329">
+  <w:num w:numId="6">
     <w:abstractNumId w:val="1"/>
   </w:num>
-  <w:num w:numId="7" w16cid:durableId="969440587">
+  <w:num w:numId="7">
     <w:abstractNumId w:val="3"/>
   </w:num>
-  <w:num w:numId="8" w16cid:durableId="1732802018">
+  <w:num w:numId="8">
     <w:abstractNumId w:val="8"/>
   </w:num>
-  <w:num w:numId="9" w16cid:durableId="1424522982">
+  <w:num w:numId="9">
     <w:abstractNumId w:val="2"/>
   </w:num>
-  <w:num w:numId="10" w16cid:durableId="644745805">
+  <w:num w:numId="10">
     <w:abstractNumId w:val="11"/>
   </w:num>
-  <w:num w:numId="11" w16cid:durableId="972632657">
+  <w:num w:numId="11">
     <w:abstractNumId w:val="6"/>
   </w:num>
-  <w:num w:numId="12" w16cid:durableId="936519689">
+  <w:num w:numId="12">
     <w:abstractNumId w:val="4"/>
   </w:num>
   <w:numIdMacAtCleanup w:val="2"/>
@@ -10984,7 +11024,7 @@
 </file>
 
 <file path=word/styles.xml><?xml version="1.0" encoding="utf-8"?>
-<w:styles xmlns:mc="http://schemas.openxmlformats.org/markup-compatibility/2006" xmlns:r="http://schemas.openxmlformats.org/officeDocument/2006/relationships" xmlns:w="http://schemas.openxmlformats.org/wordprocessingml/2006/main" xmlns:w14="http://schemas.microsoft.com/office/word/2010/wordml" xmlns:w15="http://schemas.microsoft.com/office/word/2012/wordml" xmlns:w16cex="http://schemas.microsoft.com/office/word/2018/wordml/cex" xmlns:w16cid="http://schemas.microsoft.com/office/word/2016/wordml/cid" xmlns:w16="http://schemas.microsoft.com/office/word/2018/wordml" xmlns:w16du="http://schemas.microsoft.com/office/word/2023/wordml/word16du" xmlns:w16sdtdh="http://schemas.microsoft.com/office/word/2020/wordml/sdtdatahash" xmlns:w16sdtfl="http://schemas.microsoft.com/office/word/2024/wordml/sdtformatlock" xmlns:w16se="http://schemas.microsoft.com/office/word/2015/wordml/symex" mc:Ignorable="w14 w15 w16se w16cid w16 w16cex w16sdtdh w16sdtfl w16du">
+<w:styles xmlns:mc="http://schemas.openxmlformats.org/markup-compatibility/2006" xmlns:r="http://schemas.openxmlformats.org/officeDocument/2006/relationships" xmlns:w="http://schemas.openxmlformats.org/wordprocessingml/2006/main" xmlns:w14="http://schemas.microsoft.com/office/word/2010/wordml" xmlns:w15="http://schemas.microsoft.com/office/word/2012/wordml" xmlns:w16cex="http://schemas.microsoft.com/office/word/2018/wordml/cex" xmlns:w16cid="http://schemas.microsoft.com/office/word/2016/wordml/cid" xmlns:w16="http://schemas.microsoft.com/office/word/2018/wordml" xmlns:w16sdtdh="http://schemas.microsoft.com/office/word/2020/wordml/sdtdatahash" xmlns:w16se="http://schemas.microsoft.com/office/word/2015/wordml/symex" mc:Ignorable="w14 w15 w16se w16cid w16 w16cex w16sdtdh">
   <w:docDefaults>
     <w:rPrDefault>
       <w:rPr>

</xml_diff>